<commit_message>
Fix Starter fallback aspects for chest and off-hand
The "no runeword yet" fallbacks suggested aspects already used on other
Starter slots (duplicates don't stack). Chest now uses Undying Aspect;
without Ancient's Pledge, use a two-handed weapon with Remorseless.

Co-Authored-By: Claude Opus 5.5 <noreply@anthropic.com>
Claude-Session: https://claude.ai/code/session_01TJr2FKdEPF9JYRaARaLquH
</commit_message>
<xml_diff>
--- a/Season-15-Warlock-Blazing-Scream-Guide.docx
+++ b/Season-15-Warlock-Blazing-Scream-Guide.docx
@@ -8004,7 +8004,7 @@
                 <w:sz w:val="19"/>
                 <w:szCs w:val="19"/>
               </w:rPr>
-              <w:t xml:space="preserve">A Rare chest with </w:t>
+              <w:t xml:space="preserve">A chest with </w:t>
             </w:r>
             <w:r>
               <w:rPr>
@@ -8013,23 +8013,14 @@
                 <w:sz w:val="19"/>
                 <w:szCs w:val="19"/>
               </w:rPr>
-              <w:t xml:space="preserve">Aspect of Coagulation</w:t>
-            </w:r>
-            <w:r>
-              <w:rPr>
-                <w:sz w:val="19"/>
-                <w:szCs w:val="19"/>
-              </w:rPr>
-              <w:t xml:space="preserve"> or </w:t>
-            </w:r>
-            <w:r>
-              <w:rPr>
-                <w:i/>
-                <w:iCs/>
-                <w:sz w:val="19"/>
-                <w:szCs w:val="19"/>
-              </w:rPr>
-              <w:t xml:space="preserve">Aspect of the Fortress</w:t>
+              <w:t xml:space="preserve">Undying Aspect</w:t>
+            </w:r>
+            <w:r>
+              <w:rPr>
+                <w:sz w:val="19"/>
+                <w:szCs w:val="19"/>
+              </w:rPr>
+              <w:t xml:space="preserve"> (heals on cast), or another Defensive/Utility aspect you are not already using. The same aspect on two items does not stack.</w:t>
             </w:r>
           </w:p>
         </w:tc>
@@ -17091,7 +17082,39 @@
                 <w:sz w:val="19"/>
                 <w:szCs w:val="19"/>
               </w:rPr>
-              <w:t xml:space="preserve">A Rare Focus with an offensive aspect you aren't using elsewhere: Edgemaster's, Scorching Heat or Demonic.</w:t>
+              <w:t xml:space="preserve">Use a </w:t>
+            </w:r>
+            <w:r>
+              <w:rPr>
+                <w:b/>
+                <w:bCs/>
+                <w:sz w:val="19"/>
+                <w:szCs w:val="19"/>
+              </w:rPr>
+              <w:t xml:space="preserve">two-handed weapon</w:t>
+            </w:r>
+            <w:r>
+              <w:rPr>
+                <w:sz w:val="19"/>
+                <w:szCs w:val="19"/>
+              </w:rPr>
+              <w:t xml:space="preserve"> with </w:t>
+            </w:r>
+            <w:r>
+              <w:rPr>
+                <w:i/>
+                <w:iCs/>
+                <w:sz w:val="19"/>
+                <w:szCs w:val="19"/>
+              </w:rPr>
+              <w:t xml:space="preserve">Remorseless Aspect</w:t>
+            </w:r>
+            <w:r>
+              <w:rPr>
+                <w:sz w:val="19"/>
+                <w:szCs w:val="19"/>
+              </w:rPr>
+              <w:t xml:space="preserve"> and 2 Rubies instead of sword + Focus until you craft Ancient's Pledge. Maxroll's leveling setup does the same. Your other offensive aspects are already on the rings and amulet, and duplicates don't stack.</w:t>
             </w:r>
           </w:p>
         </w:tc>
@@ -48893,7 +48916,7 @@
         </w:rPr>
         <w:t xml:space="preserve">Your build page (couldn't be read automatically) — </w:t>
       </w:r>
-      <w:hyperlink w:history="1" r:id="rIdqdoylmalkaw9g4wvqsjpl">
+      <w:hyperlink w:history="1" r:id="rIdreqs-m0caxgwolx2_jusw">
         <w:r>
           <w:rPr>
             <w:rStyle w:val="Hyperlink"/>
@@ -48920,7 +48943,7 @@
         </w:rPr>
         <w:t xml:space="preserve">Maxroll – Blazing Scream Warlock Endgame Guide (S15) — </w:t>
       </w:r>
-      <w:hyperlink w:history="1" r:id="rIdmy_dsr7edkfdkoxcp1ghy">
+      <w:hyperlink w:history="1" r:id="rIdqzir_sobzxypmqt0vphne">
         <w:r>
           <w:rPr>
             <w:rStyle w:val="Hyperlink"/>
@@ -48947,7 +48970,7 @@
         </w:rPr>
         <w:t xml:space="preserve">Maxroll – planner to4erl0e (decoded for this guide) — </w:t>
       </w:r>
-      <w:hyperlink w:history="1" r:id="rId8ouf1_zqsdk89prabihmh">
+      <w:hyperlink w:history="1" r:id="rIdktpbhapjymh9zkvlqxssz">
         <w:r>
           <w:rPr>
             <w:rStyle w:val="Hyperlink"/>
@@ -48974,7 +48997,7 @@
         </w:rPr>
         <w:t xml:space="preserve">Maxroll – Blazing Scream Leveling Guide — </w:t>
       </w:r>
-      <w:hyperlink w:history="1" r:id="rIdjx57lckchokruq3fpyoby">
+      <w:hyperlink w:history="1" r:id="rId3jib9ycuwlt2-tg6db50p">
         <w:r>
           <w:rPr>
             <w:rStyle w:val="Hyperlink"/>
@@ -49001,7 +49024,7 @@
         </w:rPr>
         <w:t xml:space="preserve">Maxroll – Season of Hell's Legacy guide — </w:t>
       </w:r>
-      <w:hyperlink w:history="1" r:id="rId8deiwokqvzn-h1oe35c7g">
+      <w:hyperlink w:history="1" r:id="rId3gkh0fzeognyohnxtcoph">
         <w:r>
           <w:rPr>
             <w:rStyle w:val="Hyperlink"/>
@@ -49028,7 +49051,7 @@
         </w:rPr>
         <w:t xml:space="preserve">Maxroll – Endgame Progression — </w:t>
       </w:r>
-      <w:hyperlink w:history="1" r:id="rIdyerm0ma0wwadfjz4xj_x0">
+      <w:hyperlink w:history="1" r:id="rId_zgytmwt30tqpncbyosll">
         <w:r>
           <w:rPr>
             <w:rStyle w:val="Hyperlink"/>
@@ -49055,7 +49078,7 @@
         </w:rPr>
         <w:t xml:space="preserve">Maxroll – War Plans — </w:t>
       </w:r>
-      <w:hyperlink w:history="1" r:id="rIdttgwpybx7udei2-qeokq8">
+      <w:hyperlink w:history="1" r:id="rIdvawyubbc_ymy9j1devk-u">
         <w:r>
           <w:rPr>
             <w:rStyle w:val="Hyperlink"/>
@@ -49082,7 +49105,7 @@
         </w:rPr>
         <w:t xml:space="preserve">Maxroll – Horadric Cube — </w:t>
       </w:r>
-      <w:hyperlink w:history="1" r:id="rIdaumqesmgrn_bdg1ip7w_a">
+      <w:hyperlink w:history="1" r:id="rIdhhmaddsvrrf1xs1q1q1p-">
         <w:r>
           <w:rPr>
             <w:rStyle w:val="Hyperlink"/>
@@ -49109,7 +49132,7 @@
         </w:rPr>
         <w:t xml:space="preserve">Maxroll – Item Crafting — </w:t>
       </w:r>
-      <w:hyperlink w:history="1" r:id="rIdpzfbxda5lrpcoshhyfcpj">
+      <w:hyperlink w:history="1" r:id="rId5xrha47iysymijvuffhev">
         <w:r>
           <w:rPr>
             <w:rStyle w:val="Hyperlink"/>
@@ -49136,7 +49159,7 @@
         </w:rPr>
         <w:t xml:space="preserve">D4Guides – Blazing Scream Endgame Build (S-Tier) — </w:t>
       </w:r>
-      <w:hyperlink w:history="1" r:id="rIdh8ytnt_wllnii1xn63vmr">
+      <w:hyperlink w:history="1" r:id="rIdhwdb7m-lfaaeh4gxa-05w">
         <w:r>
           <w:rPr>
             <w:rStyle w:val="Hyperlink"/>
@@ -49163,7 +49186,7 @@
         </w:rPr>
         <w:t xml:space="preserve">D4Guides – All 32 Soul Splinters — </w:t>
       </w:r>
-      <w:hyperlink w:history="1" r:id="rIdujh6w1hga_pxvrpemr-wt">
+      <w:hyperlink w:history="1" r:id="rIdmjyeocbneoir9zffroy7w">
         <w:r>
           <w:rPr>
             <w:rStyle w:val="Hyperlink"/>
@@ -49190,7 +49213,7 @@
         </w:rPr>
         <w:t xml:space="preserve">D4Guides – Twelve new runes (S15) — </w:t>
       </w:r>
-      <w:hyperlink w:history="1" r:id="rIdduluhw2ww6n_13afducku">
+      <w:hyperlink w:history="1" r:id="rIdis6wuyemlvhy5vepizzrd">
         <w:r>
           <w:rPr>
             <w:rStyle w:val="Hyperlink"/>
@@ -49217,7 +49240,7 @@
         </w:rPr>
         <w:t xml:space="preserve">D4Guides – Splinter of Destruction — </w:t>
       </w:r>
-      <w:hyperlink w:history="1" r:id="rIdmc17p62tavrjqh-lcj9gt">
+      <w:hyperlink w:history="1" r:id="rId-aq67u8rcismxwkwpwy--">
         <w:r>
           <w:rPr>
             <w:rStyle w:val="Hyperlink"/>
@@ -49244,7 +49267,7 @@
         </w:rPr>
         <w:t xml:space="preserve">D4Guides – Boss loot — </w:t>
       </w:r>
-      <w:hyperlink w:history="1" r:id="rIdfjao9dn-qg-hnlm0pzjuh">
+      <w:hyperlink w:history="1" r:id="rIdlron0vhh3ga3zhh9dsikj">
         <w:r>
           <w:rPr>
             <w:rStyle w:val="Hyperlink"/>
@@ -49271,7 +49294,7 @@
         </w:rPr>
         <w:t xml:space="preserve">DiabloFilter – How to farm Soul Splinters — </w:t>
       </w:r>
-      <w:hyperlink w:history="1" r:id="rId7fcjj6p12cuswsnj_ttsb">
+      <w:hyperlink w:history="1" r:id="rIdjjk8maus5rwyuwdk6h3wo">
         <w:r>
           <w:rPr>
             <w:rStyle w:val="Hyperlink"/>
@@ -49298,7 +49321,7 @@
         </w:rPr>
         <w:t xml:space="preserve">Helltides – Season 15 Splinters — </w:t>
       </w:r>
-      <w:hyperlink w:history="1" r:id="rIdh6ya7vylo4ulybubq6pov">
+      <w:hyperlink w:history="1" r:id="rIdky9byde_afxfsp9ipk8z6">
         <w:r>
           <w:rPr>
             <w:rStyle w:val="Hyperlink"/>
@@ -49325,7 +49348,7 @@
         </w:rPr>
         <w:t xml:space="preserve">timesaver – Season Rank guide — </w:t>
       </w:r>
-      <w:hyperlink w:history="1" r:id="rIdcvoam5ytjk3vqibmukelx">
+      <w:hyperlink w:history="1" r:id="rIdbfvvuwxrax4ul2lya-bor">
         <w:r>
           <w:rPr>
             <w:rStyle w:val="Hyperlink"/>
@@ -49352,7 +49375,7 @@
         </w:rPr>
         <w:t xml:space="preserve">timesaver – Which splinter to choose — </w:t>
       </w:r>
-      <w:hyperlink w:history="1" r:id="rId-bgy4n5ighok0qlewzv77">
+      <w:hyperlink w:history="1" r:id="rId3uh5v0vquah7aq5bgj9u6">
         <w:r>
           <w:rPr>
             <w:rStyle w:val="Hyperlink"/>
@@ -49379,7 +49402,7 @@
         </w:rPr>
         <w:t xml:space="preserve">Mythic Store – S15 endgame, level 70 to T12 — </w:t>
       </w:r>
-      <w:hyperlink w:history="1" r:id="rIdc64gwc2khxxwkkaenfwix">
+      <w:hyperlink w:history="1" r:id="rIds6n97kcfhhljflg0g0rkp">
         <w:r>
           <w:rPr>
             <w:rStyle w:val="Hyperlink"/>
@@ -49406,7 +49429,7 @@
         </w:rPr>
         <w:t xml:space="preserve">expcarry – Torment guide — </w:t>
       </w:r>
-      <w:hyperlink w:history="1" r:id="rIdogrwrosn94zdqm2er8ndr">
+      <w:hyperlink w:history="1" r:id="rIdfjnztwrnbhwqtqpovmgrp">
         <w:r>
           <w:rPr>
             <w:rStyle w:val="Hyperlink"/>
@@ -49433,7 +49456,7 @@
         </w:rPr>
         <w:t xml:space="preserve">Icy Veins – Runeword crafting in S15 — </w:t>
       </w:r>
-      <w:hyperlink w:history="1" r:id="rIdfzvkptd0i2pas2zdgd2ig">
+      <w:hyperlink w:history="1" r:id="rIdvb09qbjbkrl9y5a9e39ci">
         <w:r>
           <w:rPr>
             <w:rStyle w:val="Hyperlink"/>
@@ -49460,7 +49483,7 @@
         </w:rPr>
         <w:t xml:space="preserve">PC Gamer – Mercenaries — </w:t>
       </w:r>
-      <w:hyperlink w:history="1" r:id="rIdgzb75evw6bgzlfyg5rus1">
+      <w:hyperlink w:history="1" r:id="rIdtaq_gchky-zeymm4nvij5">
         <w:r>
           <w:rPr>
             <w:rStyle w:val="Hyperlink"/>
@@ -49487,7 +49510,7 @@
         </w:rPr>
         <w:t xml:space="preserve">Fextralife – The Pit — </w:t>
       </w:r>
-      <w:hyperlink w:history="1" r:id="rId2dauyliovv3lsffj15mbh">
+      <w:hyperlink w:history="1" r:id="rIds0ellsu0oghb_0iuuylkk">
         <w:r>
           <w:rPr>
             <w:rStyle w:val="Hyperlink"/>

</xml_diff>

<commit_message>
Align per-slot stat priorities with Maxroll's Starter items
The section 5.2 slot tables mixed in Midgame/Endgame stats, so they
disagreed with the Starter setup in section 11 (e.g. boots ranked
+Hellfire ranks over Willpower). Maxroll's planner caps Rares and
Legendaries at 4 affixes and treats the first four listed stats as the
real item, so rows 1-4 now match the Starter's four stats per slot,
with backups below and a Midgame+ line where the Midgame changes a
Legendary slot (boots, gloves, ring).

Also: a Starter rule-of-thumb callout and Willpower row in 5.1, fixed
runeword stats for Stealth and Ancient's Pledge in section 11, bold
four-affix targets in the section 11 and 12 tables, and a keep-with-next
option for paragraphs so table intros don't strand at a page bottom.

Co-Authored-By: Claude Opus 5.5 <noreply@anthropic.com>
Claude-Session: https://claude.ai/code/session_01TJr2FKdEPF9JYRaARaLquH
</commit_message>
<xml_diff>
--- a/Season-15-Warlock-Blazing-Scream-Guide.docx
+++ b/Season-15-Warlock-Blazing-Scream-Guide.docx
@@ -4682,7 +4682,7 @@
         <w:spacing w:after="80"/>
       </w:pPr>
       <w:r>
-        <w:t xml:space="preserve">Each gear slot can only roll certain stats. These lists come from the </w:t>
+        <w:t xml:space="preserve">Each gear slot can only roll certain stats (</w:t>
       </w:r>
       <w:r>
         <w:rPr>
@@ -4692,8 +4692,121 @@
         <w:t xml:space="preserve">Season 15 game data</w:t>
       </w:r>
       <w:r>
-        <w:t xml:space="preserve">: the affixes that can currently roll on each Warlock slot, filtered to the ones this build wants. The order follows what the build values in Maxroll's decoded setups.</w:t>
-      </w:r>
+        <w:t xml:space="preserve">). A Rare or Legendary holds </w:t>
+      </w:r>
+      <w:r>
+        <w:rPr>
+          <w:b/>
+          <w:bCs/>
+        </w:rPr>
+        <w:t xml:space="preserve">4 affixes</w:t>
+      </w:r>
+      <w:r>
+        <w:t xml:space="preserve">. In each table below, </w:t>
+      </w:r>
+      <w:r>
+        <w:rPr>
+          <w:b/>
+          <w:bCs/>
+        </w:rPr>
+        <w:t xml:space="preserve">rows 1–4 are the four stats Maxroll's Starter setup puts on that slot</w:t>
+      </w:r>
+      <w:r>
+        <w:t xml:space="preserve">, in Maxroll's order; its planner treats the first four stats listed as the actual item. Rows 5 and down are backups for when you can't get one of the four. Where the Midgame still uses a Legendary in that slot but wants different stats, a </w:t>
+      </w:r>
+      <w:r>
+        <w:rPr>
+          <w:b/>
+          <w:bCs/>
+        </w:rPr>
+        <w:t xml:space="preserve">Midgame+</w:t>
+      </w:r>
+      <w:r>
+        <w:t xml:space="preserve"> line says what changes.</w:t>
+      </w:r>
+    </w:p>
+    <w:tbl>
+      <w:tblPr>
+        <w:tblW w:type="dxa" w:w="10080"/>
+        <w:tblBorders>
+          <w:top w:val="single" w:color="auto" w:sz="4"/>
+          <w:left w:val="single" w:color="auto" w:sz="4"/>
+          <w:bottom w:val="single" w:color="auto" w:sz="4"/>
+          <w:right w:val="single" w:color="auto" w:sz="4"/>
+          <w:insideH w:val="single" w:color="auto" w:sz="4"/>
+          <w:insideV w:val="single" w:color="auto" w:sz="4"/>
+        </w:tblBorders>
+      </w:tblPr>
+      <w:tblGrid>
+        <w:gridCol w:w="10080"/>
+      </w:tblGrid>
+      <w:tr>
+        <w:trPr>
+          <w:cantSplit/>
+        </w:trPr>
+        <w:tc>
+          <w:tcPr>
+            <w:tcW w:type="dxa" w:w="10080"/>
+            <w:tcBorders>
+              <w:top w:val="none" w:color="FFFFFF" w:sz="0"/>
+              <w:left w:val="single" w:color="2F6DB5" w:sz="36"/>
+              <w:bottom w:val="none" w:color="FFFFFF" w:sz="0"/>
+              <w:right w:val="none" w:color="FFFFFF" w:sz="0"/>
+            </w:tcBorders>
+            <w:shd w:fill="EAF2FB" w:color="auto" w:val="clear"/>
+            <w:tcMar>
+              <w:top w:type="dxa" w:w="140"/>
+              <w:left w:type="dxa" w:w="220"/>
+              <w:bottom w:type="dxa" w:w="100"/>
+              <w:right w:type="dxa" w:w="220"/>
+            </w:tcMar>
+          </w:tcPr>
+          <w:p>
+            <w:pPr>
+              <w:keepNext/>
+              <w:spacing w:after="80"/>
+            </w:pPr>
+            <w:r>
+              <w:rPr>
+                <w:b/>
+                <w:bCs/>
+                <w:color w:val="2F6DB5"/>
+                <w:sz w:val="22"/>
+                <w:szCs w:val="22"/>
+              </w:rPr>
+              <w:t xml:space="preserve">Starter rule of thumb</w:t>
+            </w:r>
+          </w:p>
+          <w:p>
+            <w:pPr>
+              <w:spacing w:after="60"/>
+            </w:pPr>
+            <w:r>
+              <w:rPr>
+                <w:b/>
+                <w:bCs/>
+              </w:rPr>
+              <w:t xml:space="preserve">Willpower + Maximum Life on every piece, plus two stats for that slot.</w:t>
+            </w:r>
+            <w:r>
+              <w:t xml:space="preserve"> The gloves are the exception: Willpower, Crit Chance, Attack Speed and Vulnerable Damage.</w:t>
+            </w:r>
+          </w:p>
+          <w:p>
+            <w:pPr>
+              <w:spacing w:after="60"/>
+            </w:pPr>
+            <w:r>
+              <w:t xml:space="preserve">The Midgame changes the boots, gloves and Legendary ring (see each slot's Midgame+ line). If a piece is Ancestral and you will keep it into the Midgame, you can build it toward the Midgame stats straight away.</w:t>
+            </w:r>
+          </w:p>
+        </w:tc>
+      </w:tr>
+    </w:tbl>
+    <w:p>
+      <w:pPr>
+        <w:spacing w:after="140"/>
+      </w:pPr>
     </w:p>
     <w:p>
       <w:pPr>
@@ -5201,7 +5314,7 @@
                 <w:sz w:val="19"/>
                 <w:szCs w:val="19"/>
               </w:rPr>
-              <w:t xml:space="preserve">Maximum Life</w:t>
+              <w:t xml:space="preserve">Willpower</w:t>
             </w:r>
           </w:p>
         </w:tc>
@@ -5232,7 +5345,23 @@
                 <w:sz w:val="19"/>
                 <w:szCs w:val="19"/>
               </w:rPr>
-              <w:t xml:space="preserve">on nearly every piece</w:t>
+              <w:t xml:space="preserve">on </w:t>
+            </w:r>
+            <w:r>
+              <w:rPr>
+                <w:b/>
+                <w:bCs/>
+                <w:sz w:val="19"/>
+                <w:szCs w:val="19"/>
+              </w:rPr>
+              <w:t xml:space="preserve">every</w:t>
+            </w:r>
+            <w:r>
+              <w:rPr>
+                <w:sz w:val="19"/>
+                <w:szCs w:val="19"/>
+              </w:rPr>
+              <w:t xml:space="preserve"> piece</w:t>
             </w:r>
           </w:p>
         </w:tc>
@@ -5263,7 +5392,7 @@
                 <w:sz w:val="19"/>
                 <w:szCs w:val="19"/>
               </w:rPr>
-              <w:t xml:space="preserve">on nearly every piece</w:t>
+              <w:t xml:space="preserve">most pieces; boots and gloves drop it</w:t>
             </w:r>
           </w:p>
         </w:tc>
@@ -5299,7 +5428,7 @@
                 <w:sz w:val="19"/>
                 <w:szCs w:val="19"/>
               </w:rPr>
-              <w:t xml:space="preserve">Lucky Hit: Restore Primary Resource tempers</w:t>
+              <w:t xml:space="preserve">Maximum Life</w:t>
             </w:r>
           </w:p>
         </w:tc>
@@ -5327,19 +5456,10 @@
             </w:pPr>
             <w:r>
               <w:rPr>
-                <w:b/>
-                <w:bCs/>
-                <w:sz w:val="19"/>
-                <w:szCs w:val="19"/>
-              </w:rPr>
-              <w:t xml:space="preserve">3</w:t>
-            </w:r>
-            <w:r>
-              <w:rPr>
-                <w:sz w:val="19"/>
-                <w:szCs w:val="19"/>
-              </w:rPr>
-              <w:t xml:space="preserve"> (both rings + amulet)</w:t>
+                <w:sz w:val="19"/>
+                <w:szCs w:val="19"/>
+              </w:rPr>
+              <w:t xml:space="preserve">every piece except gloves</w:t>
             </w:r>
           </w:p>
         </w:tc>
@@ -5367,19 +5487,10 @@
             </w:pPr>
             <w:r>
               <w:rPr>
-                <w:b/>
-                <w:bCs/>
-                <w:sz w:val="19"/>
-                <w:szCs w:val="19"/>
-              </w:rPr>
-              <w:t xml:space="preserve">2</w:t>
-            </w:r>
-            <w:r>
-              <w:rPr>
-                <w:sz w:val="19"/>
-                <w:szCs w:val="19"/>
-              </w:rPr>
-              <w:t xml:space="preserve"> (both rings)</w:t>
+                <w:sz w:val="19"/>
+                <w:szCs w:val="19"/>
+              </w:rPr>
+              <w:t xml:space="preserve">on nearly every piece</w:t>
             </w:r>
           </w:p>
         </w:tc>
@@ -5415,6 +5526,122 @@
                 <w:sz w:val="19"/>
                 <w:szCs w:val="19"/>
               </w:rPr>
+              <w:t xml:space="preserve">Lucky Hit: Restore Primary Resource tempers</w:t>
+            </w:r>
+          </w:p>
+        </w:tc>
+        <w:tc>
+          <w:tcPr>
+            <w:tcW w:type="dxa" w:w="3540"/>
+            <w:tcBorders>
+              <w:top w:val="single" w:color="D9CFC7" w:sz="4"/>
+              <w:left w:val="single" w:color="D9CFC7" w:sz="4"/>
+              <w:bottom w:val="single" w:color="D9CFC7" w:sz="4"/>
+              <w:right w:val="single" w:color="D9CFC7" w:sz="4"/>
+            </w:tcBorders>
+            <w:shd w:fill="FAF5F2" w:color="auto" w:val="clear"/>
+            <w:tcMar>
+              <w:top w:type="dxa" w:w="60"/>
+              <w:left w:type="dxa" w:w="100"/>
+              <w:bottom w:type="dxa" w:w="60"/>
+              <w:right w:type="dxa" w:w="100"/>
+            </w:tcMar>
+          </w:tcPr>
+          <w:p>
+            <w:pPr>
+              <w:keepNext w:val="false"/>
+              <w:spacing w:after="0"/>
+            </w:pPr>
+            <w:r>
+              <w:rPr>
+                <w:b/>
+                <w:bCs/>
+                <w:sz w:val="19"/>
+                <w:szCs w:val="19"/>
+              </w:rPr>
+              <w:t xml:space="preserve">3</w:t>
+            </w:r>
+            <w:r>
+              <w:rPr>
+                <w:sz w:val="19"/>
+                <w:szCs w:val="19"/>
+              </w:rPr>
+              <w:t xml:space="preserve"> (both rings + amulet)</w:t>
+            </w:r>
+          </w:p>
+        </w:tc>
+        <w:tc>
+          <w:tcPr>
+            <w:tcW w:type="dxa" w:w="3540"/>
+            <w:tcBorders>
+              <w:top w:val="single" w:color="D9CFC7" w:sz="4"/>
+              <w:left w:val="single" w:color="D9CFC7" w:sz="4"/>
+              <w:bottom w:val="single" w:color="D9CFC7" w:sz="4"/>
+              <w:right w:val="single" w:color="D9CFC7" w:sz="4"/>
+            </w:tcBorders>
+            <w:shd w:fill="FAF5F2" w:color="auto" w:val="clear"/>
+            <w:tcMar>
+              <w:top w:type="dxa" w:w="60"/>
+              <w:left w:type="dxa" w:w="100"/>
+              <w:bottom w:type="dxa" w:w="60"/>
+              <w:right w:type="dxa" w:w="100"/>
+            </w:tcMar>
+          </w:tcPr>
+          <w:p>
+            <w:pPr>
+              <w:keepNext w:val="false"/>
+              <w:spacing w:after="0"/>
+            </w:pPr>
+            <w:r>
+              <w:rPr>
+                <w:b/>
+                <w:bCs/>
+                <w:sz w:val="19"/>
+                <w:szCs w:val="19"/>
+              </w:rPr>
+              <w:t xml:space="preserve">2</w:t>
+            </w:r>
+            <w:r>
+              <w:rPr>
+                <w:sz w:val="19"/>
+                <w:szCs w:val="19"/>
+              </w:rPr>
+              <w:t xml:space="preserve"> (both rings)</w:t>
+            </w:r>
+          </w:p>
+        </w:tc>
+      </w:tr>
+      <w:tr>
+        <w:trPr>
+          <w:cantSplit/>
+        </w:trPr>
+        <w:tc>
+          <w:tcPr>
+            <w:tcW w:type="dxa" w:w="3000"/>
+            <w:tcBorders>
+              <w:top w:val="single" w:color="D9CFC7" w:sz="4"/>
+              <w:left w:val="single" w:color="D9CFC7" w:sz="4"/>
+              <w:bottom w:val="single" w:color="D9CFC7" w:sz="4"/>
+              <w:right w:val="single" w:color="D9CFC7" w:sz="4"/>
+            </w:tcBorders>
+            <w:shd w:fill="FFFFFF" w:color="auto" w:val="clear"/>
+            <w:tcMar>
+              <w:top w:type="dxa" w:w="60"/>
+              <w:left w:type="dxa" w:w="100"/>
+              <w:bottom w:type="dxa" w:w="60"/>
+              <w:right w:type="dxa" w:w="100"/>
+            </w:tcMar>
+          </w:tcPr>
+          <w:p>
+            <w:pPr>
+              <w:keepNext w:val="false"/>
+              <w:spacing w:after="0"/>
+            </w:pPr>
+            <w:r>
+              <w:rPr>
+                <w:sz w:val="19"/>
+                <w:szCs w:val="19"/>
+              </w:rPr>
               <w:t xml:space="preserve">Fire Resistance</w:t>
             </w:r>
           </w:p>
@@ -5428,7 +5655,7 @@
               <w:bottom w:val="single" w:color="D9CFC7" w:sz="4"/>
               <w:right w:val="single" w:color="D9CFC7" w:sz="4"/>
             </w:tcBorders>
-            <w:shd w:fill="FAF5F2" w:color="auto" w:val="clear"/>
+            <w:shd w:fill="FFFFFF" w:color="auto" w:val="clear"/>
             <w:tcMar>
               <w:top w:type="dxa" w:w="60"/>
               <w:left w:type="dxa" w:w="100"/>
@@ -5459,7 +5686,7 @@
               <w:bottom w:val="single" w:color="D9CFC7" w:sz="4"/>
               <w:right w:val="single" w:color="D9CFC7" w:sz="4"/>
             </w:tcBorders>
-            <w:shd w:fill="FAF5F2" w:color="auto" w:val="clear"/>
+            <w:shd w:fill="FFFFFF" w:color="auto" w:val="clear"/>
             <w:tcMar>
               <w:top w:type="dxa" w:w="60"/>
               <w:left w:type="dxa" w:w="100"/>
@@ -5670,7 +5897,7 @@
               <w:t xml:space="preserve">Weapons:</w:t>
             </w:r>
             <w:r>
-              <w:t xml:space="preserve"> judge by weapon damage first, then Willpower, Crit Damage and Fire Damage. Weapon upgrades are the biggest damage jumps.</w:t>
+              <w:t xml:space="preserve"> judge by weapon damage first, then Willpower, Max Life, Fire Damage and Damage. Weapon upgrades are the biggest damage jumps.</w:t>
             </w:r>
           </w:p>
         </w:tc>
@@ -5889,7 +6116,7 @@
                 <w:sz w:val="19"/>
                 <w:szCs w:val="19"/>
               </w:rPr>
-              <w:t xml:space="preserve">Maximum Life</w:t>
+              <w:t xml:space="preserve">Willpower</w:t>
             </w:r>
           </w:p>
         </w:tc>
@@ -5920,7 +6147,7 @@
                 <w:sz w:val="19"/>
                 <w:szCs w:val="19"/>
               </w:rPr>
-              <w:t xml:space="preserve">Survival. Metamorphosis later scales damage off bonus Max Life.</w:t>
+              <w:t xml:space="preserve">Warlock main stat: skill damage and healing received.</w:t>
             </w:r>
           </w:p>
         </w:tc>
@@ -5989,7 +6216,7 @@
                 <w:sz w:val="19"/>
                 <w:szCs w:val="19"/>
               </w:rPr>
-              <w:t xml:space="preserve">+Ranks to Demonology Skills</w:t>
+              <w:t xml:space="preserve">Maximum Life</w:t>
             </w:r>
           </w:p>
         </w:tc>
@@ -6020,7 +6247,7 @@
                 <w:sz w:val="19"/>
                 <w:szCs w:val="19"/>
               </w:rPr>
-              <w:t xml:space="preserve">Blazing Scream is a Demonology skill.</w:t>
+              <w:t xml:space="preserve">Survival. Metamorphosis later scales damage off bonus Max Life.</w:t>
             </w:r>
           </w:p>
         </w:tc>
@@ -6089,7 +6316,7 @@
                 <w:sz w:val="19"/>
                 <w:szCs w:val="19"/>
               </w:rPr>
-              <w:t xml:space="preserve">Willpower</w:t>
+              <w:t xml:space="preserve">Armor</w:t>
             </w:r>
           </w:p>
         </w:tc>
@@ -6120,7 +6347,7 @@
                 <w:sz w:val="19"/>
                 <w:szCs w:val="19"/>
               </w:rPr>
-              <w:t xml:space="preserve">Warlock main stat: skill damage and healing received.</w:t>
+              <w:t xml:space="preserve">Physical damage reduction.</w:t>
             </w:r>
           </w:p>
         </w:tc>
@@ -6189,7 +6416,7 @@
                 <w:sz w:val="19"/>
                 <w:szCs w:val="19"/>
               </w:rPr>
-              <w:t xml:space="preserve">Cooldown Reduction</w:t>
+              <w:t xml:space="preserve">+Ranks to Demonology Skills</w:t>
             </w:r>
           </w:p>
         </w:tc>
@@ -6220,7 +6447,7 @@
                 <w:sz w:val="19"/>
                 <w:szCs w:val="19"/>
               </w:rPr>
-              <w:t xml:space="preserve">More Dark Prison, Metamorphosis and Apocalypse uptime.</w:t>
+              <w:t xml:space="preserve">Blazing Scream is a Demonology skill.</w:t>
             </w:r>
           </w:p>
         </w:tc>
@@ -6287,7 +6514,7 @@
                 <w:sz w:val="19"/>
                 <w:szCs w:val="19"/>
               </w:rPr>
-              <w:t xml:space="preserve">Armor</w:t>
+              <w:t xml:space="preserve">Cooldown Reduction</w:t>
             </w:r>
           </w:p>
         </w:tc>
@@ -6318,7 +6545,7 @@
                 <w:sz w:val="19"/>
                 <w:szCs w:val="19"/>
               </w:rPr>
-              <w:t xml:space="preserve">Physical damage reduction.</w:t>
+              <w:t xml:space="preserve">More Dark Prison, Metamorphosis and Apocalypse uptime.</w:t>
             </w:r>
           </w:p>
         </w:tc>
@@ -6385,7 +6612,7 @@
                 <w:sz w:val="19"/>
                 <w:szCs w:val="19"/>
               </w:rPr>
-              <w:t xml:space="preserve">Wrath per Second / Resource Generation</w:t>
+              <w:t xml:space="preserve">Resource Generation / Wrath per Second</w:t>
             </w:r>
           </w:p>
         </w:tc>
@@ -7072,7 +7299,7 @@
                 <w:sz w:val="19"/>
                 <w:szCs w:val="19"/>
               </w:rPr>
-              <w:t xml:space="preserve">Maximum Life</w:t>
+              <w:t xml:space="preserve">Willpower</w:t>
             </w:r>
           </w:p>
         </w:tc>
@@ -7103,7 +7330,7 @@
                 <w:sz w:val="19"/>
                 <w:szCs w:val="19"/>
               </w:rPr>
-              <w:t xml:space="preserve">Survival.</w:t>
+              <w:t xml:space="preserve">Main stat.</w:t>
             </w:r>
           </w:p>
         </w:tc>
@@ -7272,7 +7499,7 @@
                 <w:sz w:val="19"/>
                 <w:szCs w:val="19"/>
               </w:rPr>
-              <w:t xml:space="preserve">Wrath per Second</w:t>
+              <w:t xml:space="preserve">Maximum Life</w:t>
             </w:r>
           </w:p>
         </w:tc>
@@ -7303,7 +7530,7 @@
                 <w:sz w:val="19"/>
                 <w:szCs w:val="19"/>
               </w:rPr>
-              <w:t xml:space="preserve">Build target: more than 10 total.</w:t>
+              <w:t xml:space="preserve">Survival.</w:t>
             </w:r>
           </w:p>
         </w:tc>
@@ -7372,7 +7599,7 @@
                 <w:sz w:val="19"/>
                 <w:szCs w:val="19"/>
               </w:rPr>
-              <w:t xml:space="preserve">Willpower</w:t>
+              <w:t xml:space="preserve">Wrath per Second</w:t>
             </w:r>
           </w:p>
         </w:tc>
@@ -7403,7 +7630,7 @@
                 <w:sz w:val="19"/>
                 <w:szCs w:val="19"/>
               </w:rPr>
-              <w:t xml:space="preserve">Main stat.</w:t>
+              <w:t xml:space="preserve">Build target: more than 10 total. The masterwork target later.</w:t>
             </w:r>
           </w:p>
         </w:tc>
@@ -7857,6 +8084,75 @@
                 <w:sz w:val="19"/>
                 <w:szCs w:val="19"/>
               </w:rPr>
+              <w:t xml:space="preserve">Which chest?</w:t>
+            </w:r>
+          </w:p>
+        </w:tc>
+        <w:tc>
+          <w:tcPr>
+            <w:tcW w:type="dxa" w:w="8080"/>
+            <w:tcBorders>
+              <w:top w:val="single" w:color="D9CFC7" w:sz="4"/>
+              <w:left w:val="single" w:color="D9CFC7" w:sz="4"/>
+              <w:bottom w:val="single" w:color="D9CFC7" w:sz="4"/>
+              <w:right w:val="single" w:color="D9CFC7" w:sz="4"/>
+            </w:tcBorders>
+            <w:tcMar>
+              <w:top w:type="dxa" w:w="60"/>
+              <w:left w:type="dxa" w:w="100"/>
+              <w:bottom w:type="dxa" w:w="60"/>
+              <w:right w:type="dxa" w:w="100"/>
+            </w:tcMar>
+          </w:tcPr>
+          <w:p>
+            <w:pPr>
+              <w:keepNext/>
+              <w:spacing w:after="0"/>
+            </w:pPr>
+            <w:r>
+              <w:rPr>
+                <w:sz w:val="19"/>
+                <w:szCs w:val="19"/>
+              </w:rPr>
+              <w:t xml:space="preserve">Stealth's stats are fixed by the runeword, so this table is Maxroll's Midgame Legendary chest. Use it for a chest before you craft Stealth, and for the Midgame.</w:t>
+            </w:r>
+          </w:p>
+        </w:tc>
+      </w:tr>
+      <w:tr>
+        <w:trPr>
+          <w:cantSplit/>
+        </w:trPr>
+        <w:tc>
+          <w:tcPr>
+            <w:tcW w:type="dxa" w:w="2000"/>
+            <w:tcBorders>
+              <w:top w:val="single" w:color="D9CFC7" w:sz="4"/>
+              <w:left w:val="single" w:color="D9CFC7" w:sz="4"/>
+              <w:bottom w:val="single" w:color="D9CFC7" w:sz="4"/>
+              <w:right w:val="single" w:color="D9CFC7" w:sz="4"/>
+            </w:tcBorders>
+            <w:shd w:fill="F3E9E4" w:color="auto" w:val="clear"/>
+            <w:tcMar>
+              <w:top w:type="dxa" w:w="60"/>
+              <w:left w:type="dxa" w:w="100"/>
+              <w:bottom w:type="dxa" w:w="60"/>
+              <w:right w:type="dxa" w:w="100"/>
+            </w:tcMar>
+          </w:tcPr>
+          <w:p>
+            <w:pPr>
+              <w:keepNext/>
+              <w:spacing w:after="0"/>
+            </w:pPr>
+            <w:r>
+              <w:rPr>
+                <w:b/>
+                <w:bCs/>
+                <w:color w:val="4A1010"/>
+                <w:sz w:val="19"/>
+                <w:szCs w:val="19"/>
+              </w:rPr>
               <w:t xml:space="preserve">Aspect</w:t>
             </w:r>
           </w:p>
@@ -8454,7 +8750,7 @@
                 <w:sz w:val="19"/>
                 <w:szCs w:val="19"/>
               </w:rPr>
-              <w:t xml:space="preserve">Critical Strike Chance</w:t>
+              <w:t xml:space="preserve">Willpower</w:t>
             </w:r>
           </w:p>
         </w:tc>
@@ -8485,7 +8781,7 @@
                 <w:sz w:val="19"/>
                 <w:szCs w:val="19"/>
               </w:rPr>
-              <w:t xml:space="preserve">Toward the crit target (100% later).</w:t>
+              <w:t xml:space="preserve">Main stat.</w:t>
             </w:r>
           </w:p>
         </w:tc>
@@ -8554,7 +8850,7 @@
                 <w:sz w:val="19"/>
                 <w:szCs w:val="19"/>
               </w:rPr>
-              <w:t xml:space="preserve">Attack Speed</w:t>
+              <w:t xml:space="preserve">Critical Strike Chance</w:t>
             </w:r>
           </w:p>
         </w:tc>
@@ -8585,7 +8881,7 @@
                 <w:sz w:val="19"/>
                 <w:szCs w:val="19"/>
               </w:rPr>
-              <w:t xml:space="preserve">Toward the attack speed target (100% later).</w:t>
+              <w:t xml:space="preserve">Toward the crit target (100% later).</w:t>
             </w:r>
           </w:p>
         </w:tc>
@@ -8654,7 +8950,7 @@
                 <w:sz w:val="19"/>
                 <w:szCs w:val="19"/>
               </w:rPr>
-              <w:t xml:space="preserve">+Ranks to Blazing Scream</w:t>
+              <w:t xml:space="preserve">Attack Speed</w:t>
             </w:r>
           </w:p>
         </w:tc>
@@ -8685,7 +8981,7 @@
                 <w:sz w:val="19"/>
                 <w:szCs w:val="19"/>
               </w:rPr>
-              <w:t xml:space="preserve">Only gloves roll this. Huge.</w:t>
+              <w:t xml:space="preserve">Toward the attack speed target (100% later).</w:t>
             </w:r>
           </w:p>
         </w:tc>
@@ -8754,7 +9050,7 @@
                 <w:sz w:val="19"/>
                 <w:szCs w:val="19"/>
               </w:rPr>
-              <w:t xml:space="preserve">Critical Strike Damage</w:t>
+              <w:t xml:space="preserve">Vulnerable Damage</w:t>
             </w:r>
           </w:p>
         </w:tc>
@@ -8785,7 +9081,7 @@
                 <w:sz w:val="19"/>
                 <w:szCs w:val="19"/>
               </w:rPr>
-              <w:t xml:space="preserve">Gloves roll the high "Greater" range.</w:t>
+              <w:t xml:space="preserve">Accursed Touch keeps enemies Vulnerable.</w:t>
             </w:r>
           </w:p>
         </w:tc>
@@ -8852,7 +9148,7 @@
                 <w:sz w:val="19"/>
                 <w:szCs w:val="19"/>
               </w:rPr>
-              <w:t xml:space="preserve">Vulnerable Damage</w:t>
+              <w:t xml:space="preserve">Fire Damage</w:t>
             </w:r>
           </w:p>
         </w:tc>
@@ -8883,7 +9179,7 @@
                 <w:sz w:val="19"/>
                 <w:szCs w:val="19"/>
               </w:rPr>
-              <w:t xml:space="preserve">The build keeps enemies Vulnerable.</w:t>
+              <w:t xml:space="preserve">Blazing Scream is Fire / Hellfire.</w:t>
             </w:r>
           </w:p>
         </w:tc>
@@ -8950,7 +9246,7 @@
                 <w:sz w:val="19"/>
                 <w:szCs w:val="19"/>
               </w:rPr>
-              <w:t xml:space="preserve">Fire Damage</w:t>
+              <w:t xml:space="preserve">Critical Strike Damage</w:t>
             </w:r>
           </w:p>
         </w:tc>
@@ -8981,7 +9277,7 @@
                 <w:sz w:val="19"/>
                 <w:szCs w:val="19"/>
               </w:rPr>
-              <w:t xml:space="preserve">Blazing Scream is Fire / Hellfire.</w:t>
+              <w:t xml:space="preserve">Gloves roll the high "Greater" range. Top 4 from the Midgame.</w:t>
             </w:r>
           </w:p>
         </w:tc>
@@ -9146,7 +9442,7 @@
                 <w:sz w:val="19"/>
                 <w:szCs w:val="19"/>
               </w:rPr>
-              <w:t xml:space="preserve">Willpower</w:t>
+              <w:t xml:space="preserve">+Ranks to Blazing Scream</w:t>
             </w:r>
           </w:p>
         </w:tc>
@@ -9177,7 +9473,7 @@
                 <w:sz w:val="19"/>
                 <w:szCs w:val="19"/>
               </w:rPr>
-              <w:t xml:space="preserve">Main stat.</w:t>
+              <w:t xml:space="preserve">Nice bonus, but Maxroll ranks it below these.</w:t>
             </w:r>
           </w:p>
         </w:tc>
@@ -9239,6 +9535,100 @@
                 <w:sz w:val="19"/>
                 <w:szCs w:val="19"/>
               </w:rPr>
+              <w:t xml:space="preserve">Midgame+</w:t>
+            </w:r>
+          </w:p>
+        </w:tc>
+        <w:tc>
+          <w:tcPr>
+            <w:tcW w:type="dxa" w:w="8080"/>
+            <w:tcBorders>
+              <w:top w:val="single" w:color="D9CFC7" w:sz="4"/>
+              <w:left w:val="single" w:color="D9CFC7" w:sz="4"/>
+              <w:bottom w:val="single" w:color="D9CFC7" w:sz="4"/>
+              <w:right w:val="single" w:color="D9CFC7" w:sz="4"/>
+            </w:tcBorders>
+            <w:tcMar>
+              <w:top w:type="dxa" w:w="60"/>
+              <w:left w:type="dxa" w:w="100"/>
+              <w:bottom w:type="dxa" w:w="60"/>
+              <w:right w:type="dxa" w:w="100"/>
+            </w:tcMar>
+          </w:tcPr>
+          <w:p>
+            <w:pPr>
+              <w:keepNext/>
+              <w:spacing w:after="0"/>
+            </w:pPr>
+            <w:r>
+              <w:rPr>
+                <w:i/>
+                <w:iCs/>
+                <w:sz w:val="19"/>
+                <w:szCs w:val="19"/>
+              </w:rPr>
+              <w:t xml:space="preserve">Aspect of Ignition</w:t>
+            </w:r>
+            <w:r>
+              <w:rPr>
+                <w:sz w:val="19"/>
+                <w:szCs w:val="19"/>
+              </w:rPr>
+              <w:t xml:space="preserve"> gloves want </w:t>
+            </w:r>
+            <w:r>
+              <w:rPr>
+                <w:b/>
+                <w:bCs/>
+                <w:sz w:val="19"/>
+                <w:szCs w:val="19"/>
+              </w:rPr>
+              <w:t xml:space="preserve">Attack Speed, Crit Chance, Crit Damage, Vulnerable Damage</w:t>
+            </w:r>
+            <w:r>
+              <w:rPr>
+                <w:sz w:val="19"/>
+                <w:szCs w:val="19"/>
+              </w:rPr>
+              <w:t xml:space="preserve">. Willpower drops out; Crit Damage is the masterwork target.</w:t>
+            </w:r>
+          </w:p>
+        </w:tc>
+      </w:tr>
+      <w:tr>
+        <w:trPr>
+          <w:cantSplit/>
+        </w:trPr>
+        <w:tc>
+          <w:tcPr>
+            <w:tcW w:type="dxa" w:w="2000"/>
+            <w:tcBorders>
+              <w:top w:val="single" w:color="D9CFC7" w:sz="4"/>
+              <w:left w:val="single" w:color="D9CFC7" w:sz="4"/>
+              <w:bottom w:val="single" w:color="D9CFC7" w:sz="4"/>
+              <w:right w:val="single" w:color="D9CFC7" w:sz="4"/>
+            </w:tcBorders>
+            <w:shd w:fill="F3E9E4" w:color="auto" w:val="clear"/>
+            <w:tcMar>
+              <w:top w:type="dxa" w:w="60"/>
+              <w:left w:type="dxa" w:w="100"/>
+              <w:bottom w:type="dxa" w:w="60"/>
+              <w:right w:type="dxa" w:w="100"/>
+            </w:tcMar>
+          </w:tcPr>
+          <w:p>
+            <w:pPr>
+              <w:keepNext/>
+              <w:spacing w:after="0"/>
+            </w:pPr>
+            <w:r>
+              <w:rPr>
+                <w:b/>
+                <w:bCs/>
+                <w:color w:val="4A1010"/>
+                <w:sz w:val="19"/>
+                <w:szCs w:val="19"/>
+              </w:rPr>
               <w:t xml:space="preserve">Aspect</w:t>
             </w:r>
           </w:p>
@@ -9767,7 +10157,7 @@
                 <w:sz w:val="19"/>
                 <w:szCs w:val="19"/>
               </w:rPr>
-              <w:t xml:space="preserve">Maximum Life</w:t>
+              <w:t xml:space="preserve">Willpower</w:t>
             </w:r>
           </w:p>
         </w:tc>
@@ -9798,7 +10188,7 @@
                 <w:sz w:val="19"/>
                 <w:szCs w:val="19"/>
               </w:rPr>
-              <w:t xml:space="preserve">Survival.</w:t>
+              <w:t xml:space="preserve">Main stat.</w:t>
             </w:r>
           </w:p>
         </w:tc>
@@ -9867,7 +10257,7 @@
                 <w:sz w:val="19"/>
                 <w:szCs w:val="19"/>
               </w:rPr>
-              <w:t xml:space="preserve">Armor</w:t>
+              <w:t xml:space="preserve">Maximum Life</w:t>
             </w:r>
           </w:p>
         </w:tc>
@@ -9898,7 +10288,7 @@
                 <w:sz w:val="19"/>
                 <w:szCs w:val="19"/>
               </w:rPr>
-              <w:t xml:space="preserve">Pants roll the high Armor range.</w:t>
+              <w:t xml:space="preserve">Survival.</w:t>
             </w:r>
           </w:p>
         </w:tc>
@@ -9967,7 +10357,7 @@
                 <w:sz w:val="19"/>
                 <w:szCs w:val="19"/>
               </w:rPr>
-              <w:t xml:space="preserve">Wrath per Second</w:t>
+              <w:t xml:space="preserve">Armor</w:t>
             </w:r>
           </w:p>
         </w:tc>
@@ -9998,7 +10388,7 @@
                 <w:sz w:val="19"/>
                 <w:szCs w:val="19"/>
               </w:rPr>
-              <w:t xml:space="preserve">Wrath sustain.</w:t>
+              <w:t xml:space="preserve">Pants roll the high Armor range.</w:t>
             </w:r>
           </w:p>
         </w:tc>
@@ -10067,7 +10457,7 @@
                 <w:sz w:val="19"/>
                 <w:szCs w:val="19"/>
               </w:rPr>
-              <w:t xml:space="preserve">Willpower</w:t>
+              <w:t xml:space="preserve">Wrath per Second</w:t>
             </w:r>
           </w:p>
         </w:tc>
@@ -10098,7 +10488,7 @@
                 <w:sz w:val="19"/>
                 <w:szCs w:val="19"/>
               </w:rPr>
-              <w:t xml:space="preserve">Main stat.</w:t>
+              <w:t xml:space="preserve">Wrath sustain.</w:t>
             </w:r>
           </w:p>
         </w:tc>
@@ -10263,7 +10653,7 @@
                 <w:sz w:val="19"/>
                 <w:szCs w:val="19"/>
               </w:rPr>
-              <w:t xml:space="preserve">Fire Resistance</w:t>
+              <w:t xml:space="preserve">Potion Charges</w:t>
             </w:r>
           </w:p>
         </w:tc>
@@ -10294,7 +10684,7 @@
                 <w:sz w:val="19"/>
                 <w:szCs w:val="19"/>
               </w:rPr>
-              <w:t xml:space="preserve">Big chunk toward the Fire target.</w:t>
+              <w:t xml:space="preserve">Quality of life.</w:t>
             </w:r>
           </w:p>
         </w:tc>
@@ -10361,7 +10751,7 @@
                 <w:sz w:val="19"/>
                 <w:szCs w:val="19"/>
               </w:rPr>
-              <w:t xml:space="preserve">Healing Received</w:t>
+              <w:t xml:space="preserve">Fire Resistance</w:t>
             </w:r>
           </w:p>
         </w:tc>
@@ -10392,105 +10782,7 @@
                 <w:sz w:val="19"/>
                 <w:szCs w:val="19"/>
               </w:rPr>
-              <w:t xml:space="preserve">Temerity Barrier later.</w:t>
-            </w:r>
-          </w:p>
-        </w:tc>
-      </w:tr>
-      <w:tr>
-        <w:trPr>
-          <w:cantSplit/>
-        </w:trPr>
-        <w:tc>
-          <w:tcPr>
-            <w:tcW w:type="dxa" w:w="700"/>
-            <w:tcBorders>
-              <w:top w:val="single" w:color="D9CFC7" w:sz="4"/>
-              <w:left w:val="single" w:color="D9CFC7" w:sz="4"/>
-              <w:bottom w:val="single" w:color="D9CFC7" w:sz="4"/>
-              <w:right w:val="single" w:color="D9CFC7" w:sz="4"/>
-            </w:tcBorders>
-            <w:shd w:fill="FAF5F2" w:color="auto" w:val="clear"/>
-            <w:tcMar>
-              <w:top w:type="dxa" w:w="60"/>
-              <w:left w:type="dxa" w:w="100"/>
-              <w:bottom w:type="dxa" w:w="60"/>
-              <w:right w:type="dxa" w:w="100"/>
-            </w:tcMar>
-          </w:tcPr>
-          <w:p>
-            <w:pPr>
-              <w:keepNext/>
-              <w:spacing w:after="0"/>
-            </w:pPr>
-            <w:r>
-              <w:rPr>
-                <w:sz w:val="19"/>
-                <w:szCs w:val="19"/>
-              </w:rPr>
-              <w:t xml:space="preserve">8</w:t>
-            </w:r>
-          </w:p>
-        </w:tc>
-        <w:tc>
-          <w:tcPr>
-            <w:tcW w:type="dxa" w:w="3400"/>
-            <w:tcBorders>
-              <w:top w:val="single" w:color="D9CFC7" w:sz="4"/>
-              <w:left w:val="single" w:color="D9CFC7" w:sz="4"/>
-              <w:bottom w:val="single" w:color="D9CFC7" w:sz="4"/>
-              <w:right w:val="single" w:color="D9CFC7" w:sz="4"/>
-            </w:tcBorders>
-            <w:shd w:fill="FAF5F2" w:color="auto" w:val="clear"/>
-            <w:tcMar>
-              <w:top w:type="dxa" w:w="60"/>
-              <w:left w:type="dxa" w:w="100"/>
-              <w:bottom w:type="dxa" w:w="60"/>
-              <w:right w:type="dxa" w:w="100"/>
-            </w:tcMar>
-          </w:tcPr>
-          <w:p>
-            <w:pPr>
-              <w:keepNext/>
-              <w:spacing w:after="0"/>
-            </w:pPr>
-            <w:r>
-              <w:rPr>
-                <w:sz w:val="19"/>
-                <w:szCs w:val="19"/>
-              </w:rPr>
-              <w:t xml:space="preserve">Potion Charges</w:t>
-            </w:r>
-          </w:p>
-        </w:tc>
-        <w:tc>
-          <w:tcPr>
-            <w:tcW w:type="dxa" w:w="5980"/>
-            <w:tcBorders>
-              <w:top w:val="single" w:color="D9CFC7" w:sz="4"/>
-              <w:left w:val="single" w:color="D9CFC7" w:sz="4"/>
-              <w:bottom w:val="single" w:color="D9CFC7" w:sz="4"/>
-              <w:right w:val="single" w:color="D9CFC7" w:sz="4"/>
-            </w:tcBorders>
-            <w:shd w:fill="FAF5F2" w:color="auto" w:val="clear"/>
-            <w:tcMar>
-              <w:top w:type="dxa" w:w="60"/>
-              <w:left w:type="dxa" w:w="100"/>
-              <w:bottom w:type="dxa" w:w="60"/>
-              <w:right w:type="dxa" w:w="100"/>
-            </w:tcMar>
-          </w:tcPr>
-          <w:p>
-            <w:pPr>
-              <w:keepNext/>
-              <w:spacing w:after="0"/>
-            </w:pPr>
-            <w:r>
-              <w:rPr>
-                <w:sz w:val="19"/>
-                <w:szCs w:val="19"/>
-              </w:rPr>
-              <w:t xml:space="preserve">Quality of life.</w:t>
+              <w:t xml:space="preserve">Big chunk toward the Fire target.</w:t>
             </w:r>
           </w:p>
         </w:tc>
@@ -11048,7 +11340,7 @@
                 <w:sz w:val="19"/>
                 <w:szCs w:val="19"/>
               </w:rPr>
-              <w:t xml:space="preserve">Movement Speed</w:t>
+              <w:t xml:space="preserve">Willpower</w:t>
             </w:r>
           </w:p>
         </w:tc>
@@ -11079,23 +11371,7 @@
                 <w:sz w:val="19"/>
                 <w:szCs w:val="19"/>
               </w:rPr>
-              <w:t xml:space="preserve">Speed, and Blazing Scream's </w:t>
-            </w:r>
-            <w:r>
-              <w:rPr>
-                <w:i/>
-                <w:iCs/>
-                <w:sz w:val="19"/>
-                <w:szCs w:val="19"/>
-              </w:rPr>
-              <w:t xml:space="preserve">Impact Velocity</w:t>
-            </w:r>
-            <w:r>
-              <w:rPr>
-                <w:sz w:val="19"/>
-                <w:szCs w:val="19"/>
-              </w:rPr>
-              <w:t xml:space="preserve"> scales with it.</w:t>
+              <w:t xml:space="preserve">Main stat.</w:t>
             </w:r>
           </w:p>
         </w:tc>
@@ -11164,7 +11440,7 @@
                 <w:sz w:val="19"/>
                 <w:szCs w:val="19"/>
               </w:rPr>
-              <w:t xml:space="preserve">Maximum Life</w:t>
+              <w:t xml:space="preserve">Movement Speed</w:t>
             </w:r>
           </w:p>
         </w:tc>
@@ -11195,7 +11471,23 @@
                 <w:sz w:val="19"/>
                 <w:szCs w:val="19"/>
               </w:rPr>
-              <w:t xml:space="preserve">Survival.</w:t>
+              <w:t xml:space="preserve">Speed, and Blazing Scream's </w:t>
+            </w:r>
+            <w:r>
+              <w:rPr>
+                <w:i/>
+                <w:iCs/>
+                <w:sz w:val="19"/>
+                <w:szCs w:val="19"/>
+              </w:rPr>
+              <w:t xml:space="preserve">Impact Velocity</w:t>
+            </w:r>
+            <w:r>
+              <w:rPr>
+                <w:sz w:val="19"/>
+                <w:szCs w:val="19"/>
+              </w:rPr>
+              <w:t xml:space="preserve"> scales with it.</w:t>
             </w:r>
           </w:p>
         </w:tc>
@@ -11264,7 +11556,7 @@
                 <w:sz w:val="19"/>
                 <w:szCs w:val="19"/>
               </w:rPr>
-              <w:t xml:space="preserve">Wrath per Second</w:t>
+              <w:t xml:space="preserve">Maximum Life</w:t>
             </w:r>
           </w:p>
         </w:tc>
@@ -11295,7 +11587,7 @@
                 <w:sz w:val="19"/>
                 <w:szCs w:val="19"/>
               </w:rPr>
-              <w:t xml:space="preserve">Wrath sustain.</w:t>
+              <w:t xml:space="preserve">Survival.</w:t>
             </w:r>
           </w:p>
         </w:tc>
@@ -11364,7 +11656,7 @@
                 <w:sz w:val="19"/>
                 <w:szCs w:val="19"/>
               </w:rPr>
-              <w:t xml:space="preserve">+Ranks to Hellfire Skills</w:t>
+              <w:t xml:space="preserve">Wrath per Second</w:t>
             </w:r>
           </w:p>
         </w:tc>
@@ -11395,7 +11687,7 @@
                 <w:sz w:val="19"/>
                 <w:szCs w:val="19"/>
               </w:rPr>
-              <w:t xml:space="preserve">Blazing Scream is Hellfire.</w:t>
+              <w:t xml:space="preserve">Wrath sustain.</w:t>
             </w:r>
           </w:p>
         </w:tc>
@@ -11462,7 +11754,7 @@
                 <w:sz w:val="19"/>
                 <w:szCs w:val="19"/>
               </w:rPr>
-              <w:t xml:space="preserve">Willpower</w:t>
+              <w:t xml:space="preserve">+Ranks to Rampage</w:t>
             </w:r>
           </w:p>
         </w:tc>
@@ -11493,7 +11785,7 @@
                 <w:sz w:val="19"/>
                 <w:szCs w:val="19"/>
               </w:rPr>
-              <w:t xml:space="preserve">Main stat.</w:t>
+              <w:t xml:space="preserve">Rampage is your Starter tank.</w:t>
             </w:r>
           </w:p>
         </w:tc>
@@ -11658,7 +11950,7 @@
                 <w:sz w:val="19"/>
                 <w:szCs w:val="19"/>
               </w:rPr>
-              <w:t xml:space="preserve">Resistance to All Elements</w:t>
+              <w:t xml:space="preserve">+Ranks to Hellfire Skills</w:t>
             </w:r>
           </w:p>
         </w:tc>
@@ -11689,7 +11981,7 @@
                 <w:sz w:val="19"/>
                 <w:szCs w:val="19"/>
               </w:rPr>
-              <w:t xml:space="preserve">Resistances.</w:t>
+              <w:t xml:space="preserve">Not in the Starter list, but a top-4 stat from the Midgame on (Blazing Scream is Hellfire).</w:t>
             </w:r>
           </w:p>
         </w:tc>
@@ -11756,7 +12048,7 @@
                 <w:sz w:val="19"/>
                 <w:szCs w:val="19"/>
               </w:rPr>
-              <w:t xml:space="preserve">+Ranks to Rampage (Starter) / Evade Charges (Teleport build)</w:t>
+              <w:t xml:space="preserve">Resistance to All Elements / Evade Charges (Teleport build)</w:t>
             </w:r>
           </w:p>
         </w:tc>
@@ -11787,7 +12079,7 @@
                 <w:sz w:val="19"/>
                 <w:szCs w:val="19"/>
               </w:rPr>
-              <w:t xml:space="preserve">Situational bonuses.</w:t>
+              <w:t xml:space="preserve">Situational.</w:t>
             </w:r>
           </w:p>
         </w:tc>
@@ -11849,6 +12141,116 @@
                 <w:sz w:val="19"/>
                 <w:szCs w:val="19"/>
               </w:rPr>
+              <w:t xml:space="preserve">Midgame+</w:t>
+            </w:r>
+          </w:p>
+        </w:tc>
+        <w:tc>
+          <w:tcPr>
+            <w:tcW w:type="dxa" w:w="8080"/>
+            <w:tcBorders>
+              <w:top w:val="single" w:color="D9CFC7" w:sz="4"/>
+              <w:left w:val="single" w:color="D9CFC7" w:sz="4"/>
+              <w:bottom w:val="single" w:color="D9CFC7" w:sz="4"/>
+              <w:right w:val="single" w:color="D9CFC7" w:sz="4"/>
+            </w:tcBorders>
+            <w:tcMar>
+              <w:top w:type="dxa" w:w="60"/>
+              <w:left w:type="dxa" w:w="100"/>
+              <w:bottom w:type="dxa" w:w="60"/>
+              <w:right w:type="dxa" w:w="100"/>
+            </w:tcMar>
+          </w:tcPr>
+          <w:p>
+            <w:pPr>
+              <w:keepNext/>
+              <w:spacing w:after="0"/>
+            </w:pPr>
+            <w:r>
+              <w:rPr>
+                <w:i/>
+                <w:iCs/>
+                <w:sz w:val="19"/>
+                <w:szCs w:val="19"/>
+              </w:rPr>
+              <w:t xml:space="preserve">Sadistic</w:t>
+            </w:r>
+            <w:r>
+              <w:rPr>
+                <w:sz w:val="19"/>
+                <w:szCs w:val="19"/>
+              </w:rPr>
+              <w:t xml:space="preserve"> → </w:t>
+            </w:r>
+            <w:r>
+              <w:rPr>
+                <w:i/>
+                <w:iCs/>
+                <w:sz w:val="19"/>
+                <w:szCs w:val="19"/>
+              </w:rPr>
+              <w:t xml:space="preserve">Undying</w:t>
+            </w:r>
+            <w:r>
+              <w:rPr>
+                <w:sz w:val="19"/>
+                <w:szCs w:val="19"/>
+              </w:rPr>
+              <w:t xml:space="preserve"> boots want </w:t>
+            </w:r>
+            <w:r>
+              <w:rPr>
+                <w:b/>
+                <w:bCs/>
+                <w:sz w:val="19"/>
+                <w:szCs w:val="19"/>
+              </w:rPr>
+              <w:t xml:space="preserve">Movement Speed, Max Life, Wrath per Second, +Hellfire ranks</w:t>
+            </w:r>
+            <w:r>
+              <w:rPr>
+                <w:sz w:val="19"/>
+                <w:szCs w:val="19"/>
+              </w:rPr>
+              <w:t xml:space="preserve">. Willpower drops to 5th; Wrath per Second is the masterwork target.</w:t>
+            </w:r>
+          </w:p>
+        </w:tc>
+      </w:tr>
+      <w:tr>
+        <w:trPr>
+          <w:cantSplit/>
+        </w:trPr>
+        <w:tc>
+          <w:tcPr>
+            <w:tcW w:type="dxa" w:w="2000"/>
+            <w:tcBorders>
+              <w:top w:val="single" w:color="D9CFC7" w:sz="4"/>
+              <w:left w:val="single" w:color="D9CFC7" w:sz="4"/>
+              <w:bottom w:val="single" w:color="D9CFC7" w:sz="4"/>
+              <w:right w:val="single" w:color="D9CFC7" w:sz="4"/>
+            </w:tcBorders>
+            <w:shd w:fill="F3E9E4" w:color="auto" w:val="clear"/>
+            <w:tcMar>
+              <w:top w:type="dxa" w:w="60"/>
+              <w:left w:type="dxa" w:w="100"/>
+              <w:bottom w:type="dxa" w:w="60"/>
+              <w:right w:type="dxa" w:w="100"/>
+            </w:tcMar>
+          </w:tcPr>
+          <w:p>
+            <w:pPr>
+              <w:keepNext/>
+              <w:spacing w:after="0"/>
+            </w:pPr>
+            <w:r>
+              <w:rPr>
+                <w:b/>
+                <w:bCs/>
+                <w:color w:val="4A1010"/>
+                <w:sz w:val="19"/>
+                <w:szCs w:val="19"/>
+              </w:rPr>
               <w:t xml:space="preserve">Aspect</w:t>
             </w:r>
           </w:p>
@@ -12377,7 +12779,7 @@
                 <w:sz w:val="19"/>
                 <w:szCs w:val="19"/>
               </w:rPr>
-              <w:t xml:space="preserve">Critical Strike Chance</w:t>
+              <w:t xml:space="preserve">Willpower</w:t>
             </w:r>
           </w:p>
         </w:tc>
@@ -12408,7 +12810,7 @@
                 <w:sz w:val="19"/>
                 <w:szCs w:val="19"/>
               </w:rPr>
-              <w:t xml:space="preserve">Toward 100%.</w:t>
+              <w:t xml:space="preserve">Main stat.</w:t>
             </w:r>
           </w:p>
         </w:tc>
@@ -12477,7 +12879,7 @@
                 <w:sz w:val="19"/>
                 <w:szCs w:val="19"/>
               </w:rPr>
-              <w:t xml:space="preserve">Attack Speed</w:t>
+              <w:t xml:space="preserve">Maximum Life</w:t>
             </w:r>
           </w:p>
         </w:tc>
@@ -12508,7 +12910,7 @@
                 <w:sz w:val="19"/>
                 <w:szCs w:val="19"/>
               </w:rPr>
-              <w:t xml:space="preserve">Toward 100%.</w:t>
+              <w:t xml:space="preserve">Survival.</w:t>
             </w:r>
           </w:p>
         </w:tc>
@@ -12577,7 +12979,7 @@
                 <w:sz w:val="19"/>
                 <w:szCs w:val="19"/>
               </w:rPr>
-              <w:t xml:space="preserve">Critical Strike Damage</w:t>
+              <w:t xml:space="preserve">Attack Speed</w:t>
             </w:r>
           </w:p>
         </w:tc>
@@ -12608,7 +13010,7 @@
                 <w:sz w:val="19"/>
                 <w:szCs w:val="19"/>
               </w:rPr>
-              <w:t xml:space="preserve">Damage.</w:t>
+              <w:t xml:space="preserve">Toward the attack speed target.</w:t>
             </w:r>
           </w:p>
         </w:tc>
@@ -12775,7 +13177,7 @@
                 <w:sz w:val="19"/>
                 <w:szCs w:val="19"/>
               </w:rPr>
-              <w:t xml:space="preserve">Maximum Life</w:t>
+              <w:t xml:space="preserve">Critical Strike Chance</w:t>
             </w:r>
           </w:p>
         </w:tc>
@@ -12806,7 +13208,7 @@
                 <w:sz w:val="19"/>
                 <w:szCs w:val="19"/>
               </w:rPr>
-              <w:t xml:space="preserve">Survival.</w:t>
+              <w:t xml:space="preserve">Toward the crit target. Top 4 from the Midgame.</w:t>
             </w:r>
           </w:p>
         </w:tc>
@@ -12873,7 +13275,7 @@
                 <w:sz w:val="19"/>
                 <w:szCs w:val="19"/>
               </w:rPr>
-              <w:t xml:space="preserve">Willpower</w:t>
+              <w:t xml:space="preserve">Damage (all)</w:t>
             </w:r>
           </w:p>
         </w:tc>
@@ -12904,7 +13306,7 @@
                 <w:sz w:val="19"/>
                 <w:szCs w:val="19"/>
               </w:rPr>
-              <w:t xml:space="preserve">Main stat.</w:t>
+              <w:t xml:space="preserve">Damage.</w:t>
             </w:r>
           </w:p>
         </w:tc>
@@ -12971,7 +13373,7 @@
                 <w:sz w:val="19"/>
                 <w:szCs w:val="19"/>
               </w:rPr>
-              <w:t xml:space="preserve">Fire Damage</w:t>
+              <w:t xml:space="preserve">Critical Strike Damage</w:t>
             </w:r>
           </w:p>
         </w:tc>
@@ -13002,7 +13404,7 @@
                 <w:sz w:val="19"/>
                 <w:szCs w:val="19"/>
               </w:rPr>
-              <w:t xml:space="preserve">Damage.</w:t>
+              <w:t xml:space="preserve">Damage. Top 4 from the Midgame.</w:t>
             </w:r>
           </w:p>
         </w:tc>
@@ -13069,7 +13471,7 @@
                 <w:sz w:val="19"/>
                 <w:szCs w:val="19"/>
               </w:rPr>
-              <w:t xml:space="preserve">Resource Cost Reduction / Damage</w:t>
+              <w:t xml:space="preserve">Life on Hit</w:t>
             </w:r>
           </w:p>
         </w:tc>
@@ -13100,7 +13502,7 @@
                 <w:sz w:val="19"/>
                 <w:szCs w:val="19"/>
               </w:rPr>
-              <w:t xml:space="preserve">Filler.</w:t>
+              <w:t xml:space="preserve">Sustain.</w:t>
             </w:r>
           </w:p>
         </w:tc>
@@ -13162,6 +13564,107 @@
                 <w:sz w:val="19"/>
                 <w:szCs w:val="19"/>
               </w:rPr>
+              <w:t xml:space="preserve">Midgame+</w:t>
+            </w:r>
+          </w:p>
+        </w:tc>
+        <w:tc>
+          <w:tcPr>
+            <w:tcW w:type="dxa" w:w="8080"/>
+            <w:tcBorders>
+              <w:top w:val="single" w:color="D9CFC7" w:sz="4"/>
+              <w:left w:val="single" w:color="D9CFC7" w:sz="4"/>
+              <w:bottom w:val="single" w:color="D9CFC7" w:sz="4"/>
+              <w:right w:val="single" w:color="D9CFC7" w:sz="4"/>
+            </w:tcBorders>
+            <w:tcMar>
+              <w:top w:type="dxa" w:w="60"/>
+              <w:left w:type="dxa" w:w="100"/>
+              <w:bottom w:type="dxa" w:w="60"/>
+              <w:right w:type="dxa" w:w="100"/>
+            </w:tcMar>
+          </w:tcPr>
+          <w:p>
+            <w:pPr>
+              <w:keepNext/>
+              <w:spacing w:after="0"/>
+            </w:pPr>
+            <w:r>
+              <w:rPr>
+                <w:sz w:val="19"/>
+                <w:szCs w:val="19"/>
+              </w:rPr>
+              <w:t xml:space="preserve">The </w:t>
+            </w:r>
+            <w:r>
+              <w:rPr>
+                <w:i/>
+                <w:iCs/>
+                <w:sz w:val="19"/>
+                <w:szCs w:val="19"/>
+              </w:rPr>
+              <w:t xml:space="preserve">Demonic Aspect</w:t>
+            </w:r>
+            <w:r>
+              <w:rPr>
+                <w:sz w:val="19"/>
+                <w:szCs w:val="19"/>
+              </w:rPr>
+              <w:t xml:space="preserve"> ring wants </w:t>
+            </w:r>
+            <w:r>
+              <w:rPr>
+                <w:b/>
+                <w:bCs/>
+                <w:sz w:val="19"/>
+                <w:szCs w:val="19"/>
+              </w:rPr>
+              <w:t xml:space="preserve">Willpower, Attack Speed, Crit Chance, Crit Damage</w:t>
+            </w:r>
+            <w:r>
+              <w:rPr>
+                <w:sz w:val="19"/>
+                <w:szCs w:val="19"/>
+              </w:rPr>
+              <w:t xml:space="preserve">; Crit Chance is the masterwork target. The other ring is The Eightfold Idol, and later both rings are uniques.</w:t>
+            </w:r>
+          </w:p>
+        </w:tc>
+      </w:tr>
+      <w:tr>
+        <w:trPr>
+          <w:cantSplit/>
+        </w:trPr>
+        <w:tc>
+          <w:tcPr>
+            <w:tcW w:type="dxa" w:w="2000"/>
+            <w:tcBorders>
+              <w:top w:val="single" w:color="D9CFC7" w:sz="4"/>
+              <w:left w:val="single" w:color="D9CFC7" w:sz="4"/>
+              <w:bottom w:val="single" w:color="D9CFC7" w:sz="4"/>
+              <w:right w:val="single" w:color="D9CFC7" w:sz="4"/>
+            </w:tcBorders>
+            <w:shd w:fill="F3E9E4" w:color="auto" w:val="clear"/>
+            <w:tcMar>
+              <w:top w:type="dxa" w:w="60"/>
+              <w:left w:type="dxa" w:w="100"/>
+              <w:bottom w:type="dxa" w:w="60"/>
+              <w:right w:type="dxa" w:w="100"/>
+            </w:tcMar>
+          </w:tcPr>
+          <w:p>
+            <w:pPr>
+              <w:keepNext/>
+              <w:spacing w:after="0"/>
+            </w:pPr>
+            <w:r>
+              <w:rPr>
+                <w:b/>
+                <w:bCs/>
+                <w:color w:val="4A1010"/>
+                <w:sz w:val="19"/>
+                <w:szCs w:val="19"/>
+              </w:rPr>
               <w:t xml:space="preserve">Aspect</w:t>
             </w:r>
           </w:p>
@@ -13715,7 +14218,7 @@
                 <w:sz w:val="19"/>
                 <w:szCs w:val="19"/>
               </w:rPr>
-              <w:t xml:space="preserve">+Ranks to All Skills</w:t>
+              <w:t xml:space="preserve">Willpower</w:t>
             </w:r>
           </w:p>
         </w:tc>
@@ -13746,7 +14249,7 @@
                 <w:sz w:val="19"/>
                 <w:szCs w:val="19"/>
               </w:rPr>
-              <w:t xml:space="preserve">Best single stat here.</w:t>
+              <w:t xml:space="preserve">Main stat.</w:t>
             </w:r>
           </w:p>
         </w:tc>
@@ -13815,7 +14318,7 @@
                 <w:sz w:val="19"/>
                 <w:szCs w:val="19"/>
               </w:rPr>
-              <w:t xml:space="preserve">+Ranks to Hellfire Skills</w:t>
+              <w:t xml:space="preserve">Maximum Life</w:t>
             </w:r>
           </w:p>
         </w:tc>
@@ -13846,7 +14349,7 @@
                 <w:sz w:val="19"/>
                 <w:szCs w:val="19"/>
               </w:rPr>
-              <w:t xml:space="preserve">Blazing Scream is Hellfire.</w:t>
+              <w:t xml:space="preserve">Survival.</w:t>
             </w:r>
           </w:p>
         </w:tc>
@@ -13915,7 +14418,7 @@
                 <w:sz w:val="19"/>
                 <w:szCs w:val="19"/>
               </w:rPr>
-              <w:t xml:space="preserve">+Ranks to Demonology Skills</w:t>
+              <w:t xml:space="preserve">Vulnerable Damage</w:t>
             </w:r>
           </w:p>
         </w:tc>
@@ -13946,7 +14449,7 @@
                 <w:sz w:val="19"/>
                 <w:szCs w:val="19"/>
               </w:rPr>
-              <w:t xml:space="preserve">Blazing Scream is Demonology.</w:t>
+              <w:t xml:space="preserve">Damage.</w:t>
             </w:r>
           </w:p>
         </w:tc>
@@ -14015,7 +14518,7 @@
                 <w:sz w:val="19"/>
                 <w:szCs w:val="19"/>
               </w:rPr>
-              <w:t xml:space="preserve">Critical Strike Chance</w:t>
+              <w:t xml:space="preserve">+Ranks to Demonology Skills</w:t>
             </w:r>
           </w:p>
         </w:tc>
@@ -14046,7 +14549,7 @@
                 <w:sz w:val="19"/>
                 <w:szCs w:val="19"/>
               </w:rPr>
-              <w:t xml:space="preserve">Toward 100%.</w:t>
+              <w:t xml:space="preserve">Blazing Scream is Demonology.</w:t>
             </w:r>
           </w:p>
         </w:tc>
@@ -14113,7 +14616,7 @@
                 <w:sz w:val="19"/>
                 <w:szCs w:val="19"/>
               </w:rPr>
-              <w:t xml:space="preserve">Critical Strike Damage</w:t>
+              <w:t xml:space="preserve">Attack Speed</w:t>
             </w:r>
           </w:p>
         </w:tc>
@@ -14144,7 +14647,7 @@
                 <w:sz w:val="19"/>
                 <w:szCs w:val="19"/>
               </w:rPr>
-              <w:t xml:space="preserve">Amulet rolls the high range.</w:t>
+              <w:t xml:space="preserve">Toward the attack speed target.</w:t>
             </w:r>
           </w:p>
         </w:tc>
@@ -14211,7 +14714,7 @@
                 <w:sz w:val="19"/>
                 <w:szCs w:val="19"/>
               </w:rPr>
-              <w:t xml:space="preserve">Vulnerable Damage</w:t>
+              <w:t xml:space="preserve">+Ranks to All Skills</w:t>
             </w:r>
           </w:p>
         </w:tc>
@@ -14242,7 +14745,7 @@
                 <w:sz w:val="19"/>
                 <w:szCs w:val="19"/>
               </w:rPr>
-              <w:t xml:space="preserve">Damage.</w:t>
+              <w:t xml:space="preserve">Good bonus.</w:t>
             </w:r>
           </w:p>
         </w:tc>
@@ -14309,7 +14812,7 @@
                 <w:sz w:val="19"/>
                 <w:szCs w:val="19"/>
               </w:rPr>
-              <w:t xml:space="preserve">Attack Speed</w:t>
+              <w:t xml:space="preserve">+Ranks to Core Skills</w:t>
             </w:r>
           </w:p>
         </w:tc>
@@ -14340,7 +14843,7 @@
                 <w:sz w:val="19"/>
                 <w:szCs w:val="19"/>
               </w:rPr>
-              <w:t xml:space="preserve">Toward 100%.</w:t>
+              <w:t xml:space="preserve">Blazing Scream is a Core skill.</w:t>
             </w:r>
           </w:p>
         </w:tc>
@@ -14407,7 +14910,7 @@
                 <w:sz w:val="19"/>
                 <w:szCs w:val="19"/>
               </w:rPr>
-              <w:t xml:space="preserve">Maximum Life / Willpower</w:t>
+              <w:t xml:space="preserve">Critical Strike Chance</w:t>
             </w:r>
           </w:p>
         </w:tc>
@@ -14438,7 +14941,7 @@
                 <w:sz w:val="19"/>
                 <w:szCs w:val="19"/>
               </w:rPr>
-              <w:t xml:space="preserve">Survival / main stat. +Ranks to Core Skills is also fine.</w:t>
+              <w:t xml:space="preserve">Toward the crit target.</w:t>
             </w:r>
           </w:p>
         </w:tc>
@@ -15196,7 +15699,7 @@
                 <w:sz w:val="19"/>
                 <w:szCs w:val="19"/>
               </w:rPr>
-              <w:t xml:space="preserve">Critical Strike Damage</w:t>
+              <w:t xml:space="preserve">Maximum Life</w:t>
             </w:r>
           </w:p>
         </w:tc>
@@ -15227,7 +15730,7 @@
                 <w:sz w:val="19"/>
                 <w:szCs w:val="19"/>
               </w:rPr>
-              <w:t xml:space="preserve">Damage.</w:t>
+              <w:t xml:space="preserve">Survival. Weapons roll the high range of this too.</w:t>
             </w:r>
           </w:p>
         </w:tc>
@@ -15391,6 +15894,8 @@
             </w:pPr>
             <w:r>
               <w:rPr>
+                <w:b/>
+                <w:bCs/>
                 <w:sz w:val="19"/>
                 <w:szCs w:val="19"/>
               </w:rPr>
@@ -15492,7 +15997,7 @@
                 <w:sz w:val="19"/>
                 <w:szCs w:val="19"/>
               </w:rPr>
-              <w:t xml:space="preserve">Lucky Hit: Chance to Restore Primary Resource</w:t>
+              <w:t xml:space="preserve">Critical Strike Damage</w:t>
             </w:r>
           </w:p>
         </w:tc>
@@ -15523,7 +16028,7 @@
                 <w:sz w:val="19"/>
                 <w:szCs w:val="19"/>
               </w:rPr>
-              <w:t xml:space="preserve">Wrath sustain (Elegy rolls it too).</w:t>
+              <w:t xml:space="preserve">Damage.</w:t>
             </w:r>
           </w:p>
         </w:tc>
@@ -15590,7 +16095,7 @@
                 <w:sz w:val="19"/>
                 <w:szCs w:val="19"/>
               </w:rPr>
-              <w:t xml:space="preserve">Maximum Life</w:t>
+              <w:t xml:space="preserve">Lucky Hit: Chance to Restore Primary Resource</w:t>
             </w:r>
           </w:p>
         </w:tc>
@@ -15621,7 +16126,7 @@
                 <w:sz w:val="19"/>
                 <w:szCs w:val="19"/>
               </w:rPr>
-              <w:t xml:space="preserve">Survival.</w:t>
+              <w:t xml:space="preserve">Wrath sustain (Elegy rolls it too).</w:t>
             </w:r>
           </w:p>
         </w:tc>
@@ -16264,7 +16769,7 @@
                 <w:sz w:val="19"/>
                 <w:szCs w:val="19"/>
               </w:rPr>
-              <w:t xml:space="preserve">Critical Strike Chance</w:t>
+              <w:t xml:space="preserve">Willpower</w:t>
             </w:r>
           </w:p>
         </w:tc>
@@ -16295,7 +16800,7 @@
                 <w:sz w:val="19"/>
                 <w:szCs w:val="19"/>
               </w:rPr>
-              <w:t xml:space="preserve">Toward 100%.</w:t>
+              <w:t xml:space="preserve">Main stat.</w:t>
             </w:r>
           </w:p>
         </w:tc>
@@ -16364,7 +16869,7 @@
                 <w:sz w:val="19"/>
                 <w:szCs w:val="19"/>
               </w:rPr>
-              <w:t xml:space="preserve">Critical Strike Damage</w:t>
+              <w:t xml:space="preserve">Maximum Life</w:t>
             </w:r>
           </w:p>
         </w:tc>
@@ -16395,7 +16900,7 @@
                 <w:sz w:val="19"/>
                 <w:szCs w:val="19"/>
               </w:rPr>
-              <w:t xml:space="preserve">Damage.</w:t>
+              <w:t xml:space="preserve">Survival.</w:t>
             </w:r>
           </w:p>
         </w:tc>
@@ -16464,7 +16969,7 @@
                 <w:sz w:val="19"/>
                 <w:szCs w:val="19"/>
               </w:rPr>
-              <w:t xml:space="preserve">Fire Damage</w:t>
+              <w:t xml:space="preserve">Critical Strike Chance</w:t>
             </w:r>
           </w:p>
         </w:tc>
@@ -16495,7 +17000,7 @@
                 <w:sz w:val="19"/>
                 <w:szCs w:val="19"/>
               </w:rPr>
-              <w:t xml:space="preserve">Damage.</w:t>
+              <w:t xml:space="preserve">Toward the crit target.</w:t>
             </w:r>
           </w:p>
         </w:tc>
@@ -16564,7 +17069,7 @@
                 <w:sz w:val="19"/>
                 <w:szCs w:val="19"/>
               </w:rPr>
-              <w:t xml:space="preserve">Willpower</w:t>
+              <w:t xml:space="preserve">Critical Strike Damage</w:t>
             </w:r>
           </w:p>
         </w:tc>
@@ -16595,7 +17100,7 @@
                 <w:sz w:val="19"/>
                 <w:szCs w:val="19"/>
               </w:rPr>
-              <w:t xml:space="preserve">Main stat.</w:t>
+              <w:t xml:space="preserve">Damage.</w:t>
             </w:r>
           </w:p>
         </w:tc>
@@ -16662,7 +17167,7 @@
                 <w:sz w:val="19"/>
                 <w:szCs w:val="19"/>
               </w:rPr>
-              <w:t xml:space="preserve">Resource Cost Reduction</w:t>
+              <w:t xml:space="preserve">Fire Damage</w:t>
             </w:r>
           </w:p>
         </w:tc>
@@ -16693,7 +17198,7 @@
                 <w:sz w:val="19"/>
                 <w:szCs w:val="19"/>
               </w:rPr>
-              <w:t xml:space="preserve">Wrath sustain.</w:t>
+              <w:t xml:space="preserve">Damage.</w:t>
             </w:r>
           </w:p>
         </w:tc>
@@ -16760,7 +17265,7 @@
                 <w:sz w:val="19"/>
                 <w:szCs w:val="19"/>
               </w:rPr>
-              <w:t xml:space="preserve">Maximum Life</w:t>
+              <w:t xml:space="preserve">Resource Cost Reduction</w:t>
             </w:r>
           </w:p>
         </w:tc>
@@ -16791,7 +17296,7 @@
                 <w:sz w:val="19"/>
                 <w:szCs w:val="19"/>
               </w:rPr>
-              <w:t xml:space="preserve">Survival.</w:t>
+              <w:t xml:space="preserve">Wrath sustain.</w:t>
             </w:r>
           </w:p>
         </w:tc>
@@ -16917,6 +17422,75 @@
         <w:gridCol w:w="2000"/>
         <w:gridCol w:w="8080"/>
       </w:tblGrid>
+      <w:tr>
+        <w:trPr>
+          <w:cantSplit/>
+        </w:trPr>
+        <w:tc>
+          <w:tcPr>
+            <w:tcW w:type="dxa" w:w="2000"/>
+            <w:tcBorders>
+              <w:top w:val="single" w:color="D9CFC7" w:sz="4"/>
+              <w:left w:val="single" w:color="D9CFC7" w:sz="4"/>
+              <w:bottom w:val="single" w:color="D9CFC7" w:sz="4"/>
+              <w:right w:val="single" w:color="D9CFC7" w:sz="4"/>
+            </w:tcBorders>
+            <w:shd w:fill="F3E9E4" w:color="auto" w:val="clear"/>
+            <w:tcMar>
+              <w:top w:type="dxa" w:w="60"/>
+              <w:left w:type="dxa" w:w="100"/>
+              <w:bottom w:type="dxa" w:w="60"/>
+              <w:right w:type="dxa" w:w="100"/>
+            </w:tcMar>
+          </w:tcPr>
+          <w:p>
+            <w:pPr>
+              <w:keepNext/>
+              <w:spacing w:after="0"/>
+            </w:pPr>
+            <w:r>
+              <w:rPr>
+                <w:b/>
+                <w:bCs/>
+                <w:color w:val="4A1010"/>
+                <w:sz w:val="19"/>
+                <w:szCs w:val="19"/>
+              </w:rPr>
+              <w:t xml:space="preserve">Not a Maxroll list</w:t>
+            </w:r>
+          </w:p>
+        </w:tc>
+        <w:tc>
+          <w:tcPr>
+            <w:tcW w:type="dxa" w:w="8080"/>
+            <w:tcBorders>
+              <w:top w:val="single" w:color="D9CFC7" w:sz="4"/>
+              <w:left w:val="single" w:color="D9CFC7" w:sz="4"/>
+              <w:bottom w:val="single" w:color="D9CFC7" w:sz="4"/>
+              <w:right w:val="single" w:color="D9CFC7" w:sz="4"/>
+            </w:tcBorders>
+            <w:tcMar>
+              <w:top w:type="dxa" w:w="60"/>
+              <w:left w:type="dxa" w:w="100"/>
+              <w:bottom w:type="dxa" w:w="60"/>
+              <w:right w:type="dxa" w:w="100"/>
+            </w:tcMar>
+          </w:tcPr>
+          <w:p>
+            <w:pPr>
+              <w:keepNext/>
+              <w:spacing w:after="0"/>
+            </w:pPr>
+            <w:r>
+              <w:rPr>
+                <w:sz w:val="19"/>
+                <w:szCs w:val="19"/>
+              </w:rPr>
+              <w:t xml:space="preserve">No Maxroll setup uses a random Focus: the Starter uses Ancient's Pledge and the Midgame uses Infernal Homunculus. This list follows the Starter pattern plus Homunculus's stats.</w:t>
+            </w:r>
+          </w:p>
+        </w:tc>
+      </w:tr>
       <w:tr>
         <w:trPr>
           <w:cantSplit/>
@@ -33591,6 +34165,32 @@
         <w:spacing w:after="120"/>
       </w:pPr>
     </w:p>
+    <w:p>
+      <w:pPr>
+        <w:keepNext/>
+        <w:spacing w:after="80"/>
+      </w:pPr>
+      <w:r>
+        <w:rPr>
+          <w:b/>
+          <w:bCs/>
+        </w:rPr>
+        <w:t xml:space="preserve">Key stats:</w:t>
+      </w:r>
+      <w:r>
+        <w:t xml:space="preserve"> the </w:t>
+      </w:r>
+      <w:r>
+        <w:rPr>
+          <w:b/>
+          <w:bCs/>
+        </w:rPr>
+        <w:t xml:space="preserve">bold</w:t>
+      </w:r>
+      <w:r>
+        <w:t xml:space="preserve"> stats are the 4 affixes to aim for (a Rare or Legendary holds 4). The rest are backups if you can't get one of them.</w:t>
+      </w:r>
+    </w:p>
     <w:tbl>
       <w:tblPr>
         <w:tblW w:type="dxa" w:w="10080"/>
@@ -33890,10 +34490,19 @@
             </w:pPr>
             <w:r>
               <w:rPr>
+                <w:b/>
+                <w:bCs/>
                 <w:sz w:val="17"/>
                 <w:szCs w:val="17"/>
               </w:rPr>
-              <w:t xml:space="preserve">Willpower, Life, Armor, +Demonology, CDR, Resource Gen</w:t>
+              <w:t xml:space="preserve">Willpower, Life, Armor, +Demonology</w:t>
+            </w:r>
+            <w:r>
+              <w:rPr>
+                <w:sz w:val="17"/>
+                <w:szCs w:val="17"/>
+              </w:rPr>
+              <w:t xml:space="preserve"> · then CDR, Resource Gen</w:t>
             </w:r>
           </w:p>
         </w:tc>
@@ -34064,7 +34673,7 @@
                 <w:sz w:val="17"/>
                 <w:szCs w:val="17"/>
               </w:rPr>
-              <w:t xml:space="preserve">Willpower, Life, Armor, Wrath/s, Cost Red., All Res</w:t>
+              <w:t xml:space="preserve">Fixed by the runeword: Life, 20% DR, 25% Move Speed, 15% Resource Gain, faster casting, shorter CC</w:t>
             </w:r>
           </w:p>
         </w:tc>
@@ -34235,7 +34844,7 @@
                 <w:sz w:val="17"/>
                 <w:szCs w:val="17"/>
               </w:rPr>
-              <w:t xml:space="preserve">—</w:t>
+              <w:t xml:space="preserve">Fixed by the runeword: 35% All Damage, 35% DR, 35% Fire/Cold/Lightning/Poison Res</w:t>
             </w:r>
           </w:p>
         </w:tc>
@@ -34401,10 +35010,19 @@
             </w:pPr>
             <w:r>
               <w:rPr>
+                <w:b/>
+                <w:bCs/>
                 <w:sz w:val="17"/>
                 <w:szCs w:val="17"/>
               </w:rPr>
-              <w:t xml:space="preserve">Willpower, Life, Fire Dmg, Damage, Crit Dmg</w:t>
+              <w:t xml:space="preserve">Willpower, Life, Fire Dmg, Damage</w:t>
+            </w:r>
+            <w:r>
+              <w:rPr>
+                <w:sz w:val="17"/>
+                <w:szCs w:val="17"/>
+              </w:rPr>
+              <w:t xml:space="preserve"> · then Crit Dmg</w:t>
             </w:r>
           </w:p>
         </w:tc>
@@ -34563,10 +35181,19 @@
             </w:pPr>
             <w:r>
               <w:rPr>
+                <w:b/>
+                <w:bCs/>
                 <w:sz w:val="17"/>
                 <w:szCs w:val="17"/>
               </w:rPr>
-              <w:t xml:space="preserve">Willpower, Crit Chance, Attack Speed, Vulnerable, Fire, Crit Dmg, Life</w:t>
+              <w:t xml:space="preserve">Willpower, Crit Chance, Attack Speed, Vulnerable</w:t>
+            </w:r>
+            <w:r>
+              <w:rPr>
+                <w:sz w:val="17"/>
+                <w:szCs w:val="17"/>
+              </w:rPr>
+              <w:t xml:space="preserve"> · then Fire, Crit Dmg, Life</w:t>
             </w:r>
           </w:p>
         </w:tc>
@@ -34725,10 +35352,19 @@
             </w:pPr>
             <w:r>
               <w:rPr>
+                <w:b/>
+                <w:bCs/>
                 <w:sz w:val="17"/>
                 <w:szCs w:val="17"/>
               </w:rPr>
-              <w:t xml:space="preserve">Willpower, Life, Armor, Wrath/s, All Res</w:t>
+              <w:t xml:space="preserve">Willpower, Life, Armor, Wrath/s</w:t>
+            </w:r>
+            <w:r>
+              <w:rPr>
+                <w:sz w:val="17"/>
+                <w:szCs w:val="17"/>
+              </w:rPr>
+              <w:t xml:space="preserve"> · then All Res, Potion Charges</w:t>
             </w:r>
           </w:p>
         </w:tc>
@@ -34887,10 +35523,19 @@
             </w:pPr>
             <w:r>
               <w:rPr>
+                <w:b/>
+                <w:bCs/>
                 <w:sz w:val="17"/>
                 <w:szCs w:val="17"/>
               </w:rPr>
-              <w:t xml:space="preserve">Move Speed, Willpower, Life, Wrath/s, +Rampage, Armor</w:t>
+              <w:t xml:space="preserve">Willpower, Move Speed, Life, Wrath/s</w:t>
+            </w:r>
+            <w:r>
+              <w:rPr>
+                <w:sz w:val="17"/>
+                <w:szCs w:val="17"/>
+              </w:rPr>
+              <w:t xml:space="preserve"> · then +Rampage, Armor</w:t>
             </w:r>
           </w:p>
         </w:tc>
@@ -35049,10 +35694,19 @@
             </w:pPr>
             <w:r>
               <w:rPr>
+                <w:b/>
+                <w:bCs/>
                 <w:sz w:val="17"/>
                 <w:szCs w:val="17"/>
               </w:rPr>
-              <w:t xml:space="preserve">Willpower, Life, AS, Vulnerable, Crit Chance, Dmg, Crit Dmg</w:t>
+              <w:t xml:space="preserve">Willpower, Life, AS, Vulnerable</w:t>
+            </w:r>
+            <w:r>
+              <w:rPr>
+                <w:sz w:val="17"/>
+                <w:szCs w:val="17"/>
+              </w:rPr>
+              <w:t xml:space="preserve"> · then Crit Chance, Dmg, Crit Dmg</w:t>
             </w:r>
           </w:p>
         </w:tc>
@@ -35391,10 +36045,19 @@
             </w:pPr>
             <w:r>
               <w:rPr>
+                <w:b/>
+                <w:bCs/>
                 <w:sz w:val="17"/>
                 <w:szCs w:val="17"/>
               </w:rPr>
-              <w:t xml:space="preserve">Willpower, Life, Vulnerable, +Demonology, +All Skills, +Core, AS, Crit Chance</w:t>
+              <w:t xml:space="preserve">Willpower, Life, Vulnerable, +Demonology</w:t>
+            </w:r>
+            <w:r>
+              <w:rPr>
+                <w:sz w:val="17"/>
+                <w:szCs w:val="17"/>
+              </w:rPr>
+              <w:t xml:space="preserve"> · then AS, +All Skills, +Core, Crit Chance</w:t>
             </w:r>
           </w:p>
         </w:tc>
@@ -37167,6 +37830,25 @@
         <w:spacing w:after="120"/>
       </w:pPr>
     </w:p>
+    <w:p>
+      <w:pPr>
+        <w:keepNext/>
+        <w:spacing w:after="80"/>
+      </w:pPr>
+      <w:r>
+        <w:t xml:space="preserve">For the four Legendary slots, the </w:t>
+      </w:r>
+      <w:r>
+        <w:rPr>
+          <w:b/>
+          <w:bCs/>
+        </w:rPr>
+        <w:t xml:space="preserve">bold</w:t>
+      </w:r>
+      <w:r>
+        <w:t xml:space="preserve"> stats are the 4 affixes to aim for. They differ from the Starter on the boots, gloves and ring.</w:t>
+      </w:r>
+    </w:p>
     <w:tbl>
       <w:tblPr>
         <w:tblW w:type="dxa" w:w="10080"/>
@@ -37503,10 +38185,19 @@
             </w:pPr>
             <w:r>
               <w:rPr>
+                <w:b/>
+                <w:bCs/>
                 <w:sz w:val="17"/>
                 <w:szCs w:val="17"/>
               </w:rPr>
-              <w:t xml:space="preserve">Runes </w:t>
+              <w:t xml:space="preserve">Willpower, Armor, Life, Wrath/s</w:t>
+            </w:r>
+            <w:r>
+              <w:rPr>
+                <w:sz w:val="17"/>
+                <w:szCs w:val="17"/>
+              </w:rPr>
+              <w:t xml:space="preserve"> · runes </w:t>
             </w:r>
             <w:r>
               <w:rPr>
@@ -37819,10 +38510,19 @@
             </w:pPr>
             <w:r>
               <w:rPr>
+                <w:b/>
+                <w:bCs/>
                 <w:sz w:val="17"/>
                 <w:szCs w:val="17"/>
               </w:rPr>
-              <w:t xml:space="preserve">Until a Mythic Hand of Apotheosis with a 90%+ roll</w:t>
+              <w:t xml:space="preserve">Attack Speed, Crit Chance, Crit Dmg, Vulnerable</w:t>
+            </w:r>
+            <w:r>
+              <w:rPr>
+                <w:sz w:val="17"/>
+                <w:szCs w:val="17"/>
+              </w:rPr>
+              <w:t xml:space="preserve"> · until a Mythic Hand of Apotheosis with a 90%+ roll</w:t>
             </w:r>
           </w:p>
         </w:tc>
@@ -38026,10 +38726,19 @@
             </w:pPr>
             <w:r>
               <w:rPr>
+                <w:b/>
+                <w:bCs/>
                 <w:sz w:val="17"/>
                 <w:szCs w:val="17"/>
               </w:rPr>
-              <w:t xml:space="preserve">Heals on kills; the overheal feeds Temerity's Barrier</w:t>
+              <w:t xml:space="preserve">Move Speed, Life, Wrath/s, +Hellfire</w:t>
+            </w:r>
+            <w:r>
+              <w:rPr>
+                <w:sz w:val="17"/>
+                <w:szCs w:val="17"/>
+              </w:rPr>
+              <w:t xml:space="preserve"> · heals on kills; the overheal feeds Temerity's Barrier</w:t>
             </w:r>
           </w:p>
         </w:tc>
@@ -38133,10 +38842,19 @@
             </w:pPr>
             <w:r>
               <w:rPr>
+                <w:b/>
+                <w:bCs/>
                 <w:sz w:val="17"/>
                 <w:szCs w:val="17"/>
               </w:rPr>
-              <w:t xml:space="preserve">Splinter of </w:t>
+              <w:t xml:space="preserve">Willpower, AS, Crit Chance, Crit Dmg</w:t>
+            </w:r>
+            <w:r>
+              <w:rPr>
+                <w:sz w:val="17"/>
+                <w:szCs w:val="17"/>
+              </w:rPr>
+              <w:t xml:space="preserve"> · Splinter of </w:t>
             </w:r>
             <w:r>
               <w:rPr>
@@ -39069,6 +39787,7 @@
     </w:p>
     <w:p>
       <w:pPr>
+        <w:keepNext/>
         <w:spacing w:after="80"/>
       </w:pPr>
       <w:r>
@@ -39082,7 +39801,7 @@
         <w:t xml:space="preserve">MW</w:t>
       </w:r>
       <w:r>
-        <w:t xml:space="preserve"> = the affix to aim your masterwork capstone at.</w:t>
+        <w:t xml:space="preserve"> = the affix to aim your masterwork capstone at. On the Legendary chest and boots, the first 4 listed are the item's affixes and the rest are backups.</w:t>
       </w:r>
     </w:p>
     <w:tbl>
@@ -48916,7 +49635,7 @@
         </w:rPr>
         <w:t xml:space="preserve">Your build page (couldn't be read automatically) — </w:t>
       </w:r>
-      <w:hyperlink w:history="1" r:id="rIdreqs-m0caxgwolx2_jusw">
+      <w:hyperlink w:history="1" r:id="rIdsvmyen6pcuqrbxp_gh0ui">
         <w:r>
           <w:rPr>
             <w:rStyle w:val="Hyperlink"/>
@@ -48943,7 +49662,7 @@
         </w:rPr>
         <w:t xml:space="preserve">Maxroll – Blazing Scream Warlock Endgame Guide (S15) — </w:t>
       </w:r>
-      <w:hyperlink w:history="1" r:id="rIdqzir_sobzxypmqt0vphne">
+      <w:hyperlink w:history="1" r:id="rIdxekpo1mpq7xjxksjwizfc">
         <w:r>
           <w:rPr>
             <w:rStyle w:val="Hyperlink"/>
@@ -48970,7 +49689,7 @@
         </w:rPr>
         <w:t xml:space="preserve">Maxroll – planner to4erl0e (decoded for this guide) — </w:t>
       </w:r>
-      <w:hyperlink w:history="1" r:id="rIdktpbhapjymh9zkvlqxssz">
+      <w:hyperlink w:history="1" r:id="rIdzpwniav8w7nxnxwpwx0gq">
         <w:r>
           <w:rPr>
             <w:rStyle w:val="Hyperlink"/>
@@ -48997,7 +49716,7 @@
         </w:rPr>
         <w:t xml:space="preserve">Maxroll – Blazing Scream Leveling Guide — </w:t>
       </w:r>
-      <w:hyperlink w:history="1" r:id="rId3jib9ycuwlt2-tg6db50p">
+      <w:hyperlink w:history="1" r:id="rIdrrh_uzcsudb0wwoe7rl5k">
         <w:r>
           <w:rPr>
             <w:rStyle w:val="Hyperlink"/>
@@ -49024,7 +49743,7 @@
         </w:rPr>
         <w:t xml:space="preserve">Maxroll – Season of Hell's Legacy guide — </w:t>
       </w:r>
-      <w:hyperlink w:history="1" r:id="rId3gkh0fzeognyohnxtcoph">
+      <w:hyperlink w:history="1" r:id="rIdwrsjatlmckzzq3metvqln">
         <w:r>
           <w:rPr>
             <w:rStyle w:val="Hyperlink"/>
@@ -49051,7 +49770,7 @@
         </w:rPr>
         <w:t xml:space="preserve">Maxroll – Endgame Progression — </w:t>
       </w:r>
-      <w:hyperlink w:history="1" r:id="rId_zgytmwt30tqpncbyosll">
+      <w:hyperlink w:history="1" r:id="rIdidl2j4qecbxlxiatvoukb">
         <w:r>
           <w:rPr>
             <w:rStyle w:val="Hyperlink"/>
@@ -49078,7 +49797,7 @@
         </w:rPr>
         <w:t xml:space="preserve">Maxroll – War Plans — </w:t>
       </w:r>
-      <w:hyperlink w:history="1" r:id="rIdvawyubbc_ymy9j1devk-u">
+      <w:hyperlink w:history="1" r:id="rIdpw18aatrsr1dwlhffzrcp">
         <w:r>
           <w:rPr>
             <w:rStyle w:val="Hyperlink"/>
@@ -49105,7 +49824,7 @@
         </w:rPr>
         <w:t xml:space="preserve">Maxroll – Horadric Cube — </w:t>
       </w:r>
-      <w:hyperlink w:history="1" r:id="rIdhhmaddsvrrf1xs1q1q1p-">
+      <w:hyperlink w:history="1" r:id="rIdouui70mheszzae7mp-_6o">
         <w:r>
           <w:rPr>
             <w:rStyle w:val="Hyperlink"/>
@@ -49132,7 +49851,7 @@
         </w:rPr>
         <w:t xml:space="preserve">Maxroll – Item Crafting — </w:t>
       </w:r>
-      <w:hyperlink w:history="1" r:id="rId5xrha47iysymijvuffhev">
+      <w:hyperlink w:history="1" r:id="rIdrcinlyfpmidxgg1b-kizu">
         <w:r>
           <w:rPr>
             <w:rStyle w:val="Hyperlink"/>
@@ -49159,7 +49878,7 @@
         </w:rPr>
         <w:t xml:space="preserve">D4Guides – Blazing Scream Endgame Build (S-Tier) — </w:t>
       </w:r>
-      <w:hyperlink w:history="1" r:id="rIdhwdb7m-lfaaeh4gxa-05w">
+      <w:hyperlink w:history="1" r:id="rIdn6fds2c1rc2v6a-tpl3ze">
         <w:r>
           <w:rPr>
             <w:rStyle w:val="Hyperlink"/>
@@ -49186,7 +49905,7 @@
         </w:rPr>
         <w:t xml:space="preserve">D4Guides – All 32 Soul Splinters — </w:t>
       </w:r>
-      <w:hyperlink w:history="1" r:id="rIdmjyeocbneoir9zffroy7w">
+      <w:hyperlink w:history="1" r:id="rIdmtpo6pe2epnsp2yvay1im">
         <w:r>
           <w:rPr>
             <w:rStyle w:val="Hyperlink"/>
@@ -49213,7 +49932,7 @@
         </w:rPr>
         <w:t xml:space="preserve">D4Guides – Twelve new runes (S15) — </w:t>
       </w:r>
-      <w:hyperlink w:history="1" r:id="rIdis6wuyemlvhy5vepizzrd">
+      <w:hyperlink w:history="1" r:id="rIdo6rxown2ljvbcpgdrbllf">
         <w:r>
           <w:rPr>
             <w:rStyle w:val="Hyperlink"/>
@@ -49240,7 +49959,7 @@
         </w:rPr>
         <w:t xml:space="preserve">D4Guides – Splinter of Destruction — </w:t>
       </w:r>
-      <w:hyperlink w:history="1" r:id="rId-aq67u8rcismxwkwpwy--">
+      <w:hyperlink w:history="1" r:id="rIdmuznpyvcu4tfu-kuirwp1">
         <w:r>
           <w:rPr>
             <w:rStyle w:val="Hyperlink"/>
@@ -49267,7 +49986,7 @@
         </w:rPr>
         <w:t xml:space="preserve">D4Guides – Boss loot — </w:t>
       </w:r>
-      <w:hyperlink w:history="1" r:id="rIdlron0vhh3ga3zhh9dsikj">
+      <w:hyperlink w:history="1" r:id="rId0iztzznrspmpsbrk-hvi2">
         <w:r>
           <w:rPr>
             <w:rStyle w:val="Hyperlink"/>
@@ -49294,7 +50013,7 @@
         </w:rPr>
         <w:t xml:space="preserve">DiabloFilter – How to farm Soul Splinters — </w:t>
       </w:r>
-      <w:hyperlink w:history="1" r:id="rIdjjk8maus5rwyuwdk6h3wo">
+      <w:hyperlink w:history="1" r:id="rIdyjw0l94ug9-asasg1v6ug">
         <w:r>
           <w:rPr>
             <w:rStyle w:val="Hyperlink"/>
@@ -49321,7 +50040,7 @@
         </w:rPr>
         <w:t xml:space="preserve">Helltides – Season 15 Splinters — </w:t>
       </w:r>
-      <w:hyperlink w:history="1" r:id="rIdky9byde_afxfsp9ipk8z6">
+      <w:hyperlink w:history="1" r:id="rIdzw5xtvk7szao2s59vfqxd">
         <w:r>
           <w:rPr>
             <w:rStyle w:val="Hyperlink"/>
@@ -49348,7 +50067,7 @@
         </w:rPr>
         <w:t xml:space="preserve">timesaver – Season Rank guide — </w:t>
       </w:r>
-      <w:hyperlink w:history="1" r:id="rIdbfvvuwxrax4ul2lya-bor">
+      <w:hyperlink w:history="1" r:id="rIdb86a5e6gzl0harmtj99jq">
         <w:r>
           <w:rPr>
             <w:rStyle w:val="Hyperlink"/>
@@ -49375,7 +50094,7 @@
         </w:rPr>
         <w:t xml:space="preserve">timesaver – Which splinter to choose — </w:t>
       </w:r>
-      <w:hyperlink w:history="1" r:id="rId3uh5v0vquah7aq5bgj9u6">
+      <w:hyperlink w:history="1" r:id="rIdpgq-tawnaigaofz7i_snw">
         <w:r>
           <w:rPr>
             <w:rStyle w:val="Hyperlink"/>
@@ -49402,7 +50121,7 @@
         </w:rPr>
         <w:t xml:space="preserve">Mythic Store – S15 endgame, level 70 to T12 — </w:t>
       </w:r>
-      <w:hyperlink w:history="1" r:id="rIds6n97kcfhhljflg0g0rkp">
+      <w:hyperlink w:history="1" r:id="rId7xh315kc6uc1mswuc-huh">
         <w:r>
           <w:rPr>
             <w:rStyle w:val="Hyperlink"/>
@@ -49429,7 +50148,7 @@
         </w:rPr>
         <w:t xml:space="preserve">expcarry – Torment guide — </w:t>
       </w:r>
-      <w:hyperlink w:history="1" r:id="rIdfjnztwrnbhwqtqpovmgrp">
+      <w:hyperlink w:history="1" r:id="rIdyp6kvxil88no1rgqq79ug">
         <w:r>
           <w:rPr>
             <w:rStyle w:val="Hyperlink"/>
@@ -49456,7 +50175,7 @@
         </w:rPr>
         <w:t xml:space="preserve">Icy Veins – Runeword crafting in S15 — </w:t>
       </w:r>
-      <w:hyperlink w:history="1" r:id="rIdvb09qbjbkrl9y5a9e39ci">
+      <w:hyperlink w:history="1" r:id="rIdkxddv1btije6wclqkwrjw">
         <w:r>
           <w:rPr>
             <w:rStyle w:val="Hyperlink"/>
@@ -49483,7 +50202,7 @@
         </w:rPr>
         <w:t xml:space="preserve">PC Gamer – Mercenaries — </w:t>
       </w:r>
-      <w:hyperlink w:history="1" r:id="rIdtaq_gchky-zeymm4nvij5">
+      <w:hyperlink w:history="1" r:id="rIdsxjxhkhl9pux7bc-yekwo">
         <w:r>
           <w:rPr>
             <w:rStyle w:val="Hyperlink"/>
@@ -49510,7 +50229,7 @@
         </w:rPr>
         <w:t xml:space="preserve">Fextralife – The Pit — </w:t>
       </w:r>
-      <w:hyperlink w:history="1" r:id="rIds0ellsu0oghb_0iuuylkk">
+      <w:hyperlink w:history="1" r:id="rIdurw65optxul6szpd7xynn">
         <w:r>
           <w:rPr>
             <w:rStyle w:val="Hyperlink"/>

</xml_diff>

<commit_message>
Correct Stealth runeword stats in the Starter table
Game data gives Stealth 15% damage reduction (the affix name says 20%)
and its "faster cast rate" is the Attack_Speed_Percent_Bonus attribute,
so list it as +25% Attack Speed.

Co-Authored-By: Claude Opus 5.5 <noreply@anthropic.com>
Claude-Session: https://claude.ai/code/session_01TJr2FKdEPF9JYRaARaLquH
</commit_message>
<xml_diff>
--- a/Season-15-Warlock-Blazing-Scream-Guide.docx
+++ b/Season-15-Warlock-Blazing-Scream-Guide.docx
@@ -34673,7 +34673,7 @@
                 <w:sz w:val="17"/>
                 <w:szCs w:val="17"/>
               </w:rPr>
-              <w:t xml:space="preserve">Fixed by the runeword: Life, 20% DR, 25% Move Speed, 15% Resource Gain, faster casting, shorter CC</w:t>
+              <w:t xml:space="preserve">Fixed by the runeword: Life, 25% Attack Speed, 25% Move Speed, 15% DR, 15% Resource Gain, 25% shorter CC</w:t>
             </w:r>
           </w:p>
         </w:tc>
@@ -49635,7 +49635,7 @@
         </w:rPr>
         <w:t xml:space="preserve">Your build page (couldn't be read automatically) — </w:t>
       </w:r>
-      <w:hyperlink w:history="1" r:id="rIdsvmyen6pcuqrbxp_gh0ui">
+      <w:hyperlink w:history="1" r:id="rIdfo8kjupgp3fpmwdkfy2f6">
         <w:r>
           <w:rPr>
             <w:rStyle w:val="Hyperlink"/>
@@ -49662,7 +49662,7 @@
         </w:rPr>
         <w:t xml:space="preserve">Maxroll – Blazing Scream Warlock Endgame Guide (S15) — </w:t>
       </w:r>
-      <w:hyperlink w:history="1" r:id="rIdxekpo1mpq7xjxksjwizfc">
+      <w:hyperlink w:history="1" r:id="rIdhgsr51ro9n0yfeatht9ly">
         <w:r>
           <w:rPr>
             <w:rStyle w:val="Hyperlink"/>
@@ -49689,7 +49689,7 @@
         </w:rPr>
         <w:t xml:space="preserve">Maxroll – planner to4erl0e (decoded for this guide) — </w:t>
       </w:r>
-      <w:hyperlink w:history="1" r:id="rIdzpwniav8w7nxnxwpwx0gq">
+      <w:hyperlink w:history="1" r:id="rIdclf2rr6fvzwvq1nm54utf">
         <w:r>
           <w:rPr>
             <w:rStyle w:val="Hyperlink"/>
@@ -49716,7 +49716,7 @@
         </w:rPr>
         <w:t xml:space="preserve">Maxroll – Blazing Scream Leveling Guide — </w:t>
       </w:r>
-      <w:hyperlink w:history="1" r:id="rIdrrh_uzcsudb0wwoe7rl5k">
+      <w:hyperlink w:history="1" r:id="rIdtqyx8g9jux94bngnysrrh">
         <w:r>
           <w:rPr>
             <w:rStyle w:val="Hyperlink"/>
@@ -49743,7 +49743,7 @@
         </w:rPr>
         <w:t xml:space="preserve">Maxroll – Season of Hell's Legacy guide — </w:t>
       </w:r>
-      <w:hyperlink w:history="1" r:id="rIdwrsjatlmckzzq3metvqln">
+      <w:hyperlink w:history="1" r:id="rIdt3b9ps8faedsr9o1gqazd">
         <w:r>
           <w:rPr>
             <w:rStyle w:val="Hyperlink"/>
@@ -49770,7 +49770,7 @@
         </w:rPr>
         <w:t xml:space="preserve">Maxroll – Endgame Progression — </w:t>
       </w:r>
-      <w:hyperlink w:history="1" r:id="rIdidl2j4qecbxlxiatvoukb">
+      <w:hyperlink w:history="1" r:id="rId9vcintry38z9g_nk6ex7m">
         <w:r>
           <w:rPr>
             <w:rStyle w:val="Hyperlink"/>
@@ -49797,7 +49797,7 @@
         </w:rPr>
         <w:t xml:space="preserve">Maxroll – War Plans — </w:t>
       </w:r>
-      <w:hyperlink w:history="1" r:id="rIdpw18aatrsr1dwlhffzrcp">
+      <w:hyperlink w:history="1" r:id="rIdjijj3jyk7-ln-9sihvwwp">
         <w:r>
           <w:rPr>
             <w:rStyle w:val="Hyperlink"/>
@@ -49824,7 +49824,7 @@
         </w:rPr>
         <w:t xml:space="preserve">Maxroll – Horadric Cube — </w:t>
       </w:r>
-      <w:hyperlink w:history="1" r:id="rIdouui70mheszzae7mp-_6o">
+      <w:hyperlink w:history="1" r:id="rIdxhzgzde7fhs4b_4zoftsf">
         <w:r>
           <w:rPr>
             <w:rStyle w:val="Hyperlink"/>
@@ -49851,7 +49851,7 @@
         </w:rPr>
         <w:t xml:space="preserve">Maxroll – Item Crafting — </w:t>
       </w:r>
-      <w:hyperlink w:history="1" r:id="rIdrcinlyfpmidxgg1b-kizu">
+      <w:hyperlink w:history="1" r:id="rIdaqsmagzdvemafwl2zjyvd">
         <w:r>
           <w:rPr>
             <w:rStyle w:val="Hyperlink"/>
@@ -49878,7 +49878,7 @@
         </w:rPr>
         <w:t xml:space="preserve">D4Guides – Blazing Scream Endgame Build (S-Tier) — </w:t>
       </w:r>
-      <w:hyperlink w:history="1" r:id="rIdn6fds2c1rc2v6a-tpl3ze">
+      <w:hyperlink w:history="1" r:id="rIdars_rqjcragki5uy2o6xp">
         <w:r>
           <w:rPr>
             <w:rStyle w:val="Hyperlink"/>
@@ -49905,7 +49905,7 @@
         </w:rPr>
         <w:t xml:space="preserve">D4Guides – All 32 Soul Splinters — </w:t>
       </w:r>
-      <w:hyperlink w:history="1" r:id="rIdmtpo6pe2epnsp2yvay1im">
+      <w:hyperlink w:history="1" r:id="rId77zdm8y7wbabg_p2ibf2d">
         <w:r>
           <w:rPr>
             <w:rStyle w:val="Hyperlink"/>
@@ -49932,7 +49932,7 @@
         </w:rPr>
         <w:t xml:space="preserve">D4Guides – Twelve new runes (S15) — </w:t>
       </w:r>
-      <w:hyperlink w:history="1" r:id="rIdo6rxown2ljvbcpgdrbllf">
+      <w:hyperlink w:history="1" r:id="rIdujdutdwv3d5adpf7rrjgu">
         <w:r>
           <w:rPr>
             <w:rStyle w:val="Hyperlink"/>
@@ -49959,7 +49959,7 @@
         </w:rPr>
         <w:t xml:space="preserve">D4Guides – Splinter of Destruction — </w:t>
       </w:r>
-      <w:hyperlink w:history="1" r:id="rIdmuznpyvcu4tfu-kuirwp1">
+      <w:hyperlink w:history="1" r:id="rIdlti8h4010ruhczzjo9tra">
         <w:r>
           <w:rPr>
             <w:rStyle w:val="Hyperlink"/>
@@ -49986,7 +49986,7 @@
         </w:rPr>
         <w:t xml:space="preserve">D4Guides – Boss loot — </w:t>
       </w:r>
-      <w:hyperlink w:history="1" r:id="rId0iztzznrspmpsbrk-hvi2">
+      <w:hyperlink w:history="1" r:id="rIdc1fdc8acrxlfn7wddr26q">
         <w:r>
           <w:rPr>
             <w:rStyle w:val="Hyperlink"/>
@@ -50013,7 +50013,7 @@
         </w:rPr>
         <w:t xml:space="preserve">DiabloFilter – How to farm Soul Splinters — </w:t>
       </w:r>
-      <w:hyperlink w:history="1" r:id="rIdyjw0l94ug9-asasg1v6ug">
+      <w:hyperlink w:history="1" r:id="rIdiknc5d1o8-5tx8gfwryun">
         <w:r>
           <w:rPr>
             <w:rStyle w:val="Hyperlink"/>
@@ -50040,7 +50040,7 @@
         </w:rPr>
         <w:t xml:space="preserve">Helltides – Season 15 Splinters — </w:t>
       </w:r>
-      <w:hyperlink w:history="1" r:id="rIdzw5xtvk7szao2s59vfqxd">
+      <w:hyperlink w:history="1" r:id="rIdy5q6mecqsla2stla-l_he">
         <w:r>
           <w:rPr>
             <w:rStyle w:val="Hyperlink"/>
@@ -50067,7 +50067,7 @@
         </w:rPr>
         <w:t xml:space="preserve">timesaver – Season Rank guide — </w:t>
       </w:r>
-      <w:hyperlink w:history="1" r:id="rIdb86a5e6gzl0harmtj99jq">
+      <w:hyperlink w:history="1" r:id="rIdthebu-3mvepnjloh7xgem">
         <w:r>
           <w:rPr>
             <w:rStyle w:val="Hyperlink"/>
@@ -50094,7 +50094,7 @@
         </w:rPr>
         <w:t xml:space="preserve">timesaver – Which splinter to choose — </w:t>
       </w:r>
-      <w:hyperlink w:history="1" r:id="rIdpgq-tawnaigaofz7i_snw">
+      <w:hyperlink w:history="1" r:id="rId_etmikaxjgvap4t9pjnq7">
         <w:r>
           <w:rPr>
             <w:rStyle w:val="Hyperlink"/>
@@ -50121,7 +50121,7 @@
         </w:rPr>
         <w:t xml:space="preserve">Mythic Store – S15 endgame, level 70 to T12 — </w:t>
       </w:r>
-      <w:hyperlink w:history="1" r:id="rId7xh315kc6uc1mswuc-huh">
+      <w:hyperlink w:history="1" r:id="rIdtpu2qtwpfxls2j6vqioxl">
         <w:r>
           <w:rPr>
             <w:rStyle w:val="Hyperlink"/>
@@ -50148,7 +50148,7 @@
         </w:rPr>
         <w:t xml:space="preserve">expcarry – Torment guide — </w:t>
       </w:r>
-      <w:hyperlink w:history="1" r:id="rIdyp6kvxil88no1rgqq79ug">
+      <w:hyperlink w:history="1" r:id="rIdahnsfgzthapebttz7xwwg">
         <w:r>
           <w:rPr>
             <w:rStyle w:val="Hyperlink"/>
@@ -50175,7 +50175,7 @@
         </w:rPr>
         <w:t xml:space="preserve">Icy Veins – Runeword crafting in S15 — </w:t>
       </w:r>
-      <w:hyperlink w:history="1" r:id="rIdkxddv1btije6wclqkwrjw">
+      <w:hyperlink w:history="1" r:id="rIdzjk7mxxyd6p1uc9cq079y">
         <w:r>
           <w:rPr>
             <w:rStyle w:val="Hyperlink"/>
@@ -50202,7 +50202,7 @@
         </w:rPr>
         <w:t xml:space="preserve">PC Gamer – Mercenaries — </w:t>
       </w:r>
-      <w:hyperlink w:history="1" r:id="rIdsxjxhkhl9pux7bc-yekwo">
+      <w:hyperlink w:history="1" r:id="rIdctzduy4utjmyuu-3ev5lc">
         <w:r>
           <w:rPr>
             <w:rStyle w:val="Hyperlink"/>
@@ -50229,7 +50229,7 @@
         </w:rPr>
         <w:t xml:space="preserve">Fextralife – The Pit — </w:t>
       </w:r>
-      <w:hyperlink w:history="1" r:id="rIdurw65optxul6szpd7xynn">
+      <w:hyperlink w:history="1" r:id="rIdzzd4gbyin4nm-cadzyvru">
         <w:r>
           <w:rPr>
             <w:rStyle w:val="Hyperlink"/>

</xml_diff>

<commit_message>
Point the freed Skull Splitter point at Molten Bomb in the Midgame table
Rampage is already at 15 ranks in the Midgame setup, so the point Elegy
frees up can't go there; Molten Bomb (8 ranks) is the only skill with room.

Co-Authored-By: Claude Opus 5.5 <noreply@anthropic.com>
Claude-Session: https://claude.ai/code/session_01TJr2FKdEPF9JYRaARaLquH
</commit_message>
<xml_diff>
--- a/Season-15-Warlock-Blazing-Scream-Guide.docx
+++ b/Season-15-Warlock-Blazing-Scream-Guide.docx
@@ -37287,7 +37287,7 @@
                 <w:sz w:val="19"/>
                 <w:szCs w:val="19"/>
               </w:rPr>
-              <w:t xml:space="preserve">Skull Splitter (redundant with Elegy; the point can go to Rampage)</w:t>
+              <w:t xml:space="preserve">Skull Splitter (redundant with Elegy, so the point can go to Molten Bomb; Rampage is already at 15)</w:t>
             </w:r>
           </w:p>
         </w:tc>
@@ -49635,7 +49635,7 @@
         </w:rPr>
         <w:t xml:space="preserve">Your build page (couldn't be read automatically) — </w:t>
       </w:r>
-      <w:hyperlink w:history="1" r:id="rIdfo8kjupgp3fpmwdkfy2f6">
+      <w:hyperlink w:history="1" r:id="rIdmkipizovwa6x-s10dzl5f">
         <w:r>
           <w:rPr>
             <w:rStyle w:val="Hyperlink"/>
@@ -49662,7 +49662,7 @@
         </w:rPr>
         <w:t xml:space="preserve">Maxroll – Blazing Scream Warlock Endgame Guide (S15) — </w:t>
       </w:r>
-      <w:hyperlink w:history="1" r:id="rIdhgsr51ro9n0yfeatht9ly">
+      <w:hyperlink w:history="1" r:id="rIdj0iaptil1deddlicbslaj">
         <w:r>
           <w:rPr>
             <w:rStyle w:val="Hyperlink"/>
@@ -49689,7 +49689,7 @@
         </w:rPr>
         <w:t xml:space="preserve">Maxroll – planner to4erl0e (decoded for this guide) — </w:t>
       </w:r>
-      <w:hyperlink w:history="1" r:id="rIdclf2rr6fvzwvq1nm54utf">
+      <w:hyperlink w:history="1" r:id="rIdq3rf8ixnictppoxetnm4k">
         <w:r>
           <w:rPr>
             <w:rStyle w:val="Hyperlink"/>
@@ -49716,7 +49716,7 @@
         </w:rPr>
         <w:t xml:space="preserve">Maxroll – Blazing Scream Leveling Guide — </w:t>
       </w:r>
-      <w:hyperlink w:history="1" r:id="rIdtqyx8g9jux94bngnysrrh">
+      <w:hyperlink w:history="1" r:id="rIdssxekcjicpypzduz2n3hp">
         <w:r>
           <w:rPr>
             <w:rStyle w:val="Hyperlink"/>
@@ -49743,7 +49743,7 @@
         </w:rPr>
         <w:t xml:space="preserve">Maxroll – Season of Hell's Legacy guide — </w:t>
       </w:r>
-      <w:hyperlink w:history="1" r:id="rIdt3b9ps8faedsr9o1gqazd">
+      <w:hyperlink w:history="1" r:id="rId2qmou7naiymlasipucdu3">
         <w:r>
           <w:rPr>
             <w:rStyle w:val="Hyperlink"/>
@@ -49770,7 +49770,7 @@
         </w:rPr>
         <w:t xml:space="preserve">Maxroll – Endgame Progression — </w:t>
       </w:r>
-      <w:hyperlink w:history="1" r:id="rId9vcintry38z9g_nk6ex7m">
+      <w:hyperlink w:history="1" r:id="rIdqhsf5lcal-j3cz46ym59k">
         <w:r>
           <w:rPr>
             <w:rStyle w:val="Hyperlink"/>
@@ -49797,7 +49797,7 @@
         </w:rPr>
         <w:t xml:space="preserve">Maxroll – War Plans — </w:t>
       </w:r>
-      <w:hyperlink w:history="1" r:id="rIdjijj3jyk7-ln-9sihvwwp">
+      <w:hyperlink w:history="1" r:id="rIdpzkzst68qbbzooyijnv-v">
         <w:r>
           <w:rPr>
             <w:rStyle w:val="Hyperlink"/>
@@ -49824,7 +49824,7 @@
         </w:rPr>
         <w:t xml:space="preserve">Maxroll – Horadric Cube — </w:t>
       </w:r>
-      <w:hyperlink w:history="1" r:id="rIdxhzgzde7fhs4b_4zoftsf">
+      <w:hyperlink w:history="1" r:id="rIdz3xsq5ljme2zbcxt4nh8k">
         <w:r>
           <w:rPr>
             <w:rStyle w:val="Hyperlink"/>
@@ -49851,7 +49851,7 @@
         </w:rPr>
         <w:t xml:space="preserve">Maxroll – Item Crafting — </w:t>
       </w:r>
-      <w:hyperlink w:history="1" r:id="rIdaqsmagzdvemafwl2zjyvd">
+      <w:hyperlink w:history="1" r:id="rIdqzam47jjmtoulveihebac">
         <w:r>
           <w:rPr>
             <w:rStyle w:val="Hyperlink"/>
@@ -49878,7 +49878,7 @@
         </w:rPr>
         <w:t xml:space="preserve">D4Guides – Blazing Scream Endgame Build (S-Tier) — </w:t>
       </w:r>
-      <w:hyperlink w:history="1" r:id="rIdars_rqjcragki5uy2o6xp">
+      <w:hyperlink w:history="1" r:id="rId_yftkwbbmexhlr7gpxtgr">
         <w:r>
           <w:rPr>
             <w:rStyle w:val="Hyperlink"/>
@@ -49905,7 +49905,7 @@
         </w:rPr>
         <w:t xml:space="preserve">D4Guides – All 32 Soul Splinters — </w:t>
       </w:r>
-      <w:hyperlink w:history="1" r:id="rId77zdm8y7wbabg_p2ibf2d">
+      <w:hyperlink w:history="1" r:id="rIdqzb-8mtjire_u2ekqqfe_">
         <w:r>
           <w:rPr>
             <w:rStyle w:val="Hyperlink"/>
@@ -49932,7 +49932,7 @@
         </w:rPr>
         <w:t xml:space="preserve">D4Guides – Twelve new runes (S15) — </w:t>
       </w:r>
-      <w:hyperlink w:history="1" r:id="rIdujdutdwv3d5adpf7rrjgu">
+      <w:hyperlink w:history="1" r:id="rId0sac-daa7pjdjogzad5z7">
         <w:r>
           <w:rPr>
             <w:rStyle w:val="Hyperlink"/>
@@ -49959,7 +49959,7 @@
         </w:rPr>
         <w:t xml:space="preserve">D4Guides – Splinter of Destruction — </w:t>
       </w:r>
-      <w:hyperlink w:history="1" r:id="rIdlti8h4010ruhczzjo9tra">
+      <w:hyperlink w:history="1" r:id="rId7nnraififbcn9fprcfxic">
         <w:r>
           <w:rPr>
             <w:rStyle w:val="Hyperlink"/>
@@ -49986,7 +49986,7 @@
         </w:rPr>
         <w:t xml:space="preserve">D4Guides – Boss loot — </w:t>
       </w:r>
-      <w:hyperlink w:history="1" r:id="rIdc1fdc8acrxlfn7wddr26q">
+      <w:hyperlink w:history="1" r:id="rIdu5ho0pdtvwmlcyrm0frjt">
         <w:r>
           <w:rPr>
             <w:rStyle w:val="Hyperlink"/>
@@ -50013,7 +50013,7 @@
         </w:rPr>
         <w:t xml:space="preserve">DiabloFilter – How to farm Soul Splinters — </w:t>
       </w:r>
-      <w:hyperlink w:history="1" r:id="rIdiknc5d1o8-5tx8gfwryun">
+      <w:hyperlink w:history="1" r:id="rIdxmgwvfyidf8s8agxh-cth">
         <w:r>
           <w:rPr>
             <w:rStyle w:val="Hyperlink"/>
@@ -50040,7 +50040,7 @@
         </w:rPr>
         <w:t xml:space="preserve">Helltides – Season 15 Splinters — </w:t>
       </w:r>
-      <w:hyperlink w:history="1" r:id="rIdy5q6mecqsla2stla-l_he">
+      <w:hyperlink w:history="1" r:id="rIdqbs-aik6v8ck0eeldc2eg">
         <w:r>
           <w:rPr>
             <w:rStyle w:val="Hyperlink"/>
@@ -50067,7 +50067,7 @@
         </w:rPr>
         <w:t xml:space="preserve">timesaver – Season Rank guide — </w:t>
       </w:r>
-      <w:hyperlink w:history="1" r:id="rIdthebu-3mvepnjloh7xgem">
+      <w:hyperlink w:history="1" r:id="rIdrqgo5zcpkiq6f9me0pd5k">
         <w:r>
           <w:rPr>
             <w:rStyle w:val="Hyperlink"/>
@@ -50094,7 +50094,7 @@
         </w:rPr>
         <w:t xml:space="preserve">timesaver – Which splinter to choose — </w:t>
       </w:r>
-      <w:hyperlink w:history="1" r:id="rId_etmikaxjgvap4t9pjnq7">
+      <w:hyperlink w:history="1" r:id="rIdjh0iodwvygdvqgndyuff2">
         <w:r>
           <w:rPr>
             <w:rStyle w:val="Hyperlink"/>
@@ -50121,7 +50121,7 @@
         </w:rPr>
         <w:t xml:space="preserve">Mythic Store – S15 endgame, level 70 to T12 — </w:t>
       </w:r>
-      <w:hyperlink w:history="1" r:id="rIdtpu2qtwpfxls2j6vqioxl">
+      <w:hyperlink w:history="1" r:id="rIdzpt2tw3r712h3wo46bmvj">
         <w:r>
           <w:rPr>
             <w:rStyle w:val="Hyperlink"/>
@@ -50148,7 +50148,7 @@
         </w:rPr>
         <w:t xml:space="preserve">expcarry – Torment guide — </w:t>
       </w:r>
-      <w:hyperlink w:history="1" r:id="rIdahnsfgzthapebttz7xwwg">
+      <w:hyperlink w:history="1" r:id="rId2_wuxe5huj_b2nv7pfada">
         <w:r>
           <w:rPr>
             <w:rStyle w:val="Hyperlink"/>
@@ -50175,7 +50175,7 @@
         </w:rPr>
         <w:t xml:space="preserve">Icy Veins – Runeword crafting in S15 — </w:t>
       </w:r>
-      <w:hyperlink w:history="1" r:id="rIdzjk7mxxyd6p1uc9cq079y">
+      <w:hyperlink w:history="1" r:id="rIdaosgktust3bdwhv41kgw_">
         <w:r>
           <w:rPr>
             <w:rStyle w:val="Hyperlink"/>
@@ -50202,7 +50202,7 @@
         </w:rPr>
         <w:t xml:space="preserve">PC Gamer – Mercenaries — </w:t>
       </w:r>
-      <w:hyperlink w:history="1" r:id="rIdctzduy4utjmyuu-3ev5lc">
+      <w:hyperlink w:history="1" r:id="rIdjk34wlphumwlcijo2uusf">
         <w:r>
           <w:rPr>
             <w:rStyle w:val="Hyperlink"/>
@@ -50229,7 +50229,7 @@
         </w:rPr>
         <w:t xml:space="preserve">Fextralife – The Pit — </w:t>
       </w:r>
-      <w:hyperlink w:history="1" r:id="rIdzzd4gbyin4nm-cadzyvru">
+      <w:hyperlink w:history="1" r:id="rIdq2nc46wrp9rbkgkxssccp">
         <w:r>
           <w:rPr>
             <w:rStyle w:val="Hyperlink"/>

</xml_diff>

<commit_message>
Add Rampage to the Midgame rotation
Rampage is on the Midgame skill bar (Demonic Smash variant) but the
rotation never mentioned it. Describe its role: a Dominance-cost Hellfire
leap that enters Demonform, procs Volatility on elites and turns on the
Lesser Demon Wrath buff.

Co-Authored-By: Claude Opus 5.5 <noreply@anthropic.com>
Claude-Session: https://claude.ai/code/session_01TJr2FKdEPF9JYRaARaLquH
</commit_message>
<xml_diff>
--- a/Season-15-Warlock-Blazing-Scream-Guide.docx
+++ b/Season-15-Warlock-Blazing-Scream-Guide.docx
@@ -39521,6 +39521,26 @@
           <w:b/>
           <w:bCs/>
         </w:rPr>
+        <w:t xml:space="preserve">Rampage</w:t>
+      </w:r>
+      <w:r>
+        <w:t xml:space="preserve"> (Demonic Smash) is your leap: use it between packs and to land on elites. It counts as a Hellfire cast, puts you in Demonform, always procs Volatility on a fresh elite, and turns on the Lesser Demon Wrath buff for 5 seconds. It costs Dominance, so it isn't spammable until Anathema of the Primes switches its cost to Wrath.</w:t>
+      </w:r>
+    </w:p>
+    <w:p>
+      <w:pPr>
+        <w:pStyle w:val="ListParagraph"/>
+        <w:numPr>
+          <w:ilvl w:val="0"/>
+          <w:numId w:val="14"/>
+        </w:numPr>
+        <w:spacing w:after="70"/>
+      </w:pPr>
+      <w:r>
+        <w:rPr>
+          <w:b/>
+          <w:bCs/>
+        </w:rPr>
         <w:t xml:space="preserve">Dark Prison</w:t>
       </w:r>
       <w:r>
@@ -49635,7 +49655,7 @@
         </w:rPr>
         <w:t xml:space="preserve">Your build page (couldn't be read automatically) — </w:t>
       </w:r>
-      <w:hyperlink w:history="1" r:id="rIdmkipizovwa6x-s10dzl5f">
+      <w:hyperlink w:history="1" r:id="rIdzbbrcowlnv2essvgsm_-h">
         <w:r>
           <w:rPr>
             <w:rStyle w:val="Hyperlink"/>
@@ -49662,7 +49682,7 @@
         </w:rPr>
         <w:t xml:space="preserve">Maxroll – Blazing Scream Warlock Endgame Guide (S15) — </w:t>
       </w:r>
-      <w:hyperlink w:history="1" r:id="rIdj0iaptil1deddlicbslaj">
+      <w:hyperlink w:history="1" r:id="rIdl_dc_b6lwbvlisc9le8vm">
         <w:r>
           <w:rPr>
             <w:rStyle w:val="Hyperlink"/>
@@ -49689,7 +49709,7 @@
         </w:rPr>
         <w:t xml:space="preserve">Maxroll – planner to4erl0e (decoded for this guide) — </w:t>
       </w:r>
-      <w:hyperlink w:history="1" r:id="rIdq3rf8ixnictppoxetnm4k">
+      <w:hyperlink w:history="1" r:id="rIdhn5yuii5zc4o8w68l_zzl">
         <w:r>
           <w:rPr>
             <w:rStyle w:val="Hyperlink"/>
@@ -49716,7 +49736,7 @@
         </w:rPr>
         <w:t xml:space="preserve">Maxroll – Blazing Scream Leveling Guide — </w:t>
       </w:r>
-      <w:hyperlink w:history="1" r:id="rIdssxekcjicpypzduz2n3hp">
+      <w:hyperlink w:history="1" r:id="rIdh5clggmian8nnhstdhlvw">
         <w:r>
           <w:rPr>
             <w:rStyle w:val="Hyperlink"/>
@@ -49743,7 +49763,7 @@
         </w:rPr>
         <w:t xml:space="preserve">Maxroll – Season of Hell's Legacy guide — </w:t>
       </w:r>
-      <w:hyperlink w:history="1" r:id="rId2qmou7naiymlasipucdu3">
+      <w:hyperlink w:history="1" r:id="rIdjlped6zwb1n3uwufv1kx9">
         <w:r>
           <w:rPr>
             <w:rStyle w:val="Hyperlink"/>
@@ -49770,7 +49790,7 @@
         </w:rPr>
         <w:t xml:space="preserve">Maxroll – Endgame Progression — </w:t>
       </w:r>
-      <w:hyperlink w:history="1" r:id="rIdqhsf5lcal-j3cz46ym59k">
+      <w:hyperlink w:history="1" r:id="rIdjaqsyw9bnpirexf8gb1yo">
         <w:r>
           <w:rPr>
             <w:rStyle w:val="Hyperlink"/>
@@ -49797,7 +49817,7 @@
         </w:rPr>
         <w:t xml:space="preserve">Maxroll – War Plans — </w:t>
       </w:r>
-      <w:hyperlink w:history="1" r:id="rIdpzkzst68qbbzooyijnv-v">
+      <w:hyperlink w:history="1" r:id="rId6ee_nmfikysl-oupo8ilp">
         <w:r>
           <w:rPr>
             <w:rStyle w:val="Hyperlink"/>
@@ -49824,7 +49844,7 @@
         </w:rPr>
         <w:t xml:space="preserve">Maxroll – Horadric Cube — </w:t>
       </w:r>
-      <w:hyperlink w:history="1" r:id="rIdz3xsq5ljme2zbcxt4nh8k">
+      <w:hyperlink w:history="1" r:id="rIddrwwhjzmol_syaj6seaik">
         <w:r>
           <w:rPr>
             <w:rStyle w:val="Hyperlink"/>
@@ -49851,7 +49871,7 @@
         </w:rPr>
         <w:t xml:space="preserve">Maxroll – Item Crafting — </w:t>
       </w:r>
-      <w:hyperlink w:history="1" r:id="rIdqzam47jjmtoulveihebac">
+      <w:hyperlink w:history="1" r:id="rIdt0a9qsj9agnkwnwnrkhfb">
         <w:r>
           <w:rPr>
             <w:rStyle w:val="Hyperlink"/>
@@ -49878,7 +49898,7 @@
         </w:rPr>
         <w:t xml:space="preserve">D4Guides – Blazing Scream Endgame Build (S-Tier) — </w:t>
       </w:r>
-      <w:hyperlink w:history="1" r:id="rId_yftkwbbmexhlr7gpxtgr">
+      <w:hyperlink w:history="1" r:id="rIdkwwcjlna51ermh9kkvtob">
         <w:r>
           <w:rPr>
             <w:rStyle w:val="Hyperlink"/>
@@ -49905,7 +49925,7 @@
         </w:rPr>
         <w:t xml:space="preserve">D4Guides – All 32 Soul Splinters — </w:t>
       </w:r>
-      <w:hyperlink w:history="1" r:id="rIdqzb-8mtjire_u2ekqqfe_">
+      <w:hyperlink w:history="1" r:id="rId4zslvysxcrcm2knkldoqz">
         <w:r>
           <w:rPr>
             <w:rStyle w:val="Hyperlink"/>
@@ -49932,7 +49952,7 @@
         </w:rPr>
         <w:t xml:space="preserve">D4Guides – Twelve new runes (S15) — </w:t>
       </w:r>
-      <w:hyperlink w:history="1" r:id="rId0sac-daa7pjdjogzad5z7">
+      <w:hyperlink w:history="1" r:id="rIdtrwncjgz_ke1rpu0hzlg-">
         <w:r>
           <w:rPr>
             <w:rStyle w:val="Hyperlink"/>
@@ -49959,7 +49979,7 @@
         </w:rPr>
         <w:t xml:space="preserve">D4Guides – Splinter of Destruction — </w:t>
       </w:r>
-      <w:hyperlink w:history="1" r:id="rId7nnraififbcn9fprcfxic">
+      <w:hyperlink w:history="1" r:id="rIdkvb7wrwnsrn_dvyy1-kgp">
         <w:r>
           <w:rPr>
             <w:rStyle w:val="Hyperlink"/>
@@ -49986,7 +50006,7 @@
         </w:rPr>
         <w:t xml:space="preserve">D4Guides – Boss loot — </w:t>
       </w:r>
-      <w:hyperlink w:history="1" r:id="rIdu5ho0pdtvwmlcyrm0frjt">
+      <w:hyperlink w:history="1" r:id="rIdo3jo7gttwtq426a9ao1on">
         <w:r>
           <w:rPr>
             <w:rStyle w:val="Hyperlink"/>
@@ -50013,7 +50033,7 @@
         </w:rPr>
         <w:t xml:space="preserve">DiabloFilter – How to farm Soul Splinters — </w:t>
       </w:r>
-      <w:hyperlink w:history="1" r:id="rIdxmgwvfyidf8s8agxh-cth">
+      <w:hyperlink w:history="1" r:id="rIdtuytpp86h3jrtabwgu4ac">
         <w:r>
           <w:rPr>
             <w:rStyle w:val="Hyperlink"/>
@@ -50040,7 +50060,7 @@
         </w:rPr>
         <w:t xml:space="preserve">Helltides – Season 15 Splinters — </w:t>
       </w:r>
-      <w:hyperlink w:history="1" r:id="rIdqbs-aik6v8ck0eeldc2eg">
+      <w:hyperlink w:history="1" r:id="rIdl1o0mvnfswhai0cw2u1_j">
         <w:r>
           <w:rPr>
             <w:rStyle w:val="Hyperlink"/>
@@ -50067,7 +50087,7 @@
         </w:rPr>
         <w:t xml:space="preserve">timesaver – Season Rank guide — </w:t>
       </w:r>
-      <w:hyperlink w:history="1" r:id="rIdrqgo5zcpkiq6f9me0pd5k">
+      <w:hyperlink w:history="1" r:id="rIdpby1tlc73pozvfowaahjc">
         <w:r>
           <w:rPr>
             <w:rStyle w:val="Hyperlink"/>
@@ -50094,7 +50114,7 @@
         </w:rPr>
         <w:t xml:space="preserve">timesaver – Which splinter to choose — </w:t>
       </w:r>
-      <w:hyperlink w:history="1" r:id="rIdjh0iodwvygdvqgndyuff2">
+      <w:hyperlink w:history="1" r:id="rIdvh36slruob6gceqxnv3uh">
         <w:r>
           <w:rPr>
             <w:rStyle w:val="Hyperlink"/>
@@ -50121,7 +50141,7 @@
         </w:rPr>
         <w:t xml:space="preserve">Mythic Store – S15 endgame, level 70 to T12 — </w:t>
       </w:r>
-      <w:hyperlink w:history="1" r:id="rIdzpt2tw3r712h3wo46bmvj">
+      <w:hyperlink w:history="1" r:id="rIds_f_bxacvtmeaqdxxzorp">
         <w:r>
           <w:rPr>
             <w:rStyle w:val="Hyperlink"/>
@@ -50148,7 +50168,7 @@
         </w:rPr>
         <w:t xml:space="preserve">expcarry – Torment guide — </w:t>
       </w:r>
-      <w:hyperlink w:history="1" r:id="rId2_wuxe5huj_b2nv7pfada">
+      <w:hyperlink w:history="1" r:id="rIdnkhzn3usroz5mcb62yi2w">
         <w:r>
           <w:rPr>
             <w:rStyle w:val="Hyperlink"/>
@@ -50175,7 +50195,7 @@
         </w:rPr>
         <w:t xml:space="preserve">Icy Veins – Runeword crafting in S15 — </w:t>
       </w:r>
-      <w:hyperlink w:history="1" r:id="rIdaosgktust3bdwhv41kgw_">
+      <w:hyperlink w:history="1" r:id="rIdawyjavostq82h4xug1a3k">
         <w:r>
           <w:rPr>
             <w:rStyle w:val="Hyperlink"/>
@@ -50202,7 +50222,7 @@
         </w:rPr>
         <w:t xml:space="preserve">PC Gamer – Mercenaries — </w:t>
       </w:r>
-      <w:hyperlink w:history="1" r:id="rIdjk34wlphumwlcijo2uusf">
+      <w:hyperlink w:history="1" r:id="rId0g7ojvk-gr4u0hxsl0qyo">
         <w:r>
           <w:rPr>
             <w:rStyle w:val="Hyperlink"/>
@@ -50229,7 +50249,7 @@
         </w:rPr>
         <w:t xml:space="preserve">Fextralife – The Pit — </w:t>
       </w:r>
-      <w:hyperlink w:history="1" r:id="rIdq2nc46wrp9rbkgkxssccp">
+      <w:hyperlink w:history="1" r:id="rId9elftbowao8iciuzyy0ic">
         <w:r>
           <w:rPr>
             <w:rStyle w:val="Hyperlink"/>

</xml_diff>